<commit_message>
docs: nanokolloid hujjatida formulalar Word tenglamasi (OMML) ko'rinishiga o'tkazildi
Co-authored-by: arena-agent <297053741+arena-agent@users.noreply.github.com>
</commit_message>
<xml_diff>
--- a/docs/oquv/mustaqil-talim/Nanokolloid-sistemalar-mustaqil-ish.docx
+++ b/docs/oquv/mustaqil-talim/Nanokolloid-sistemalar-mustaqil-ish.docx
@@ -60,7 +60,7 @@
           <w:b w:val="0"/>
           <w:i w:val="0"/>
         </w:rPr>
-        <w:t>Ishda nanokolloid sistemalarning (1–100 nm) asosiy fizik-kimyoviy xossalari — sirt energiyasi, eruvchanlik, optik, magnit, katalitik va reologik xususiyatlar hamda agregativ barqarorlik — zarracha o'lchami, geometrik shakli va sirt modifikatsiyasi nuqtayi nazaridan qisqa tahlil qilinadi. Gibbs–Tomson, Ostvald–Freyndlix, Stoks, Eynshteyn tenglamalari va DLVO nazariyasi asosida "tuzilma → xossa" bog'liqligi ko'rsatiladi; nazoratning instrumental usullari (DLS, ζ-potensial, TEM, XRD, UV-Vis, BET) umumlashtiriladi.</w:t>
+        <w:t>Ishda nanokolloid sistemalarning (1–100 nm) asosiy fizik-kimyoviy xossalari — sirt energiyasi, eruvchanlik, optik, magnit, katalitik va reologik xususiyatlar hamda agregativ barqarorlik — zarracha o'lchami, geometrik shakli va sirt modifikatsiyasi nuqtayi nazaridan qisqa tahlil qilinadi. Gibbs–Tomson, Ostvald–Freyndlix, Stoks, Brus, Eynshteyn tenglamalari va DLVO nazariyasi asosida "tuzilma → xossa" bog'liqligi ko'rsatiladi; nazoratning instrumental usullari (DLS, ζ-potensial, TEM, XRD, UV-Vis, BET) umumlashtiriladi.</w:t>
       </w:r>
     </w:p>
     <w:p>
@@ -301,6 +301,7 @@
     </w:p>
     <w:p>
       <w:pPr>
+        <w:spacing w:after="40"/>
         <w:jc w:val="both"/>
       </w:pPr>
       <w:r>
@@ -308,63 +309,246 @@
           <w:b w:val="0"/>
           <w:i w:val="0"/>
         </w:rPr>
-        <w:t xml:space="preserve">Sferik zarracha uchun solishtirma sirt </w:t>
+        <w:t>Sferik zarracha uchun solishtirma sirt (birlik massaga to'g'ri keladigan sirt) quyidagicha aniqlanadi:</w:t>
       </w:r>
+    </w:p>
+    <w:tbl>
+      <w:tblPr>
+        <w:tblW w:type="auto" w:w="0"/>
+        <w:jc w:val="center"/>
+        <w:tblLook w:firstColumn="1" w:firstRow="1" w:lastColumn="0" w:lastRow="0" w:noHBand="0" w:noVBand="1" w:val="04A0"/>
+      </w:tblPr>
+      <w:tblGrid>
+        <w:gridCol w:w="4986"/>
+        <w:gridCol w:w="4986"/>
+      </w:tblGrid>
+      <w:tr>
+        <w:tc>
+          <w:tcPr>
+            <w:tcW w:type="dxa" w:w="8220"/>
+          </w:tcPr>
+          <w:p>
+            <w:pPr>
+              <w:spacing w:after="40" w:before="40"/>
+              <w:jc w:val="center"/>
+            </w:pPr>
+            <m:oMath>
+              <m:sSub>
+                <m:e>
+                  <m:r>
+                    <m:t xml:space="preserve">S</m:t>
+                  </m:r>
+                </m:e>
+                <m:sub>
+                  <m:r>
+                    <m:rPr>
+                      <m:sty m:val="p"/>
+                    </m:rPr>
+                    <m:t xml:space="preserve">sol</m:t>
+                  </m:r>
+                </m:sub>
+              </m:sSub>
+              <m:r>
+                <m:rPr>
+                  <m:sty m:val="p"/>
+                </m:rPr>
+                <m:t xml:space="preserve"> = </m:t>
+              </m:r>
+              <m:f>
+                <m:num>
+                  <m:r>
+                    <m:rPr>
+                      <m:sty m:val="p"/>
+                    </m:rPr>
+                    <m:t xml:space="preserve">6</m:t>
+                  </m:r>
+                </m:num>
+                <m:den>
+                  <m:r>
+                    <m:t xml:space="preserve">ρ</m:t>
+                  </m:r>
+                  <m:r>
+                    <m:t xml:space="preserve">d</m:t>
+                  </m:r>
+                </m:den>
+              </m:f>
+            </m:oMath>
+          </w:p>
+        </w:tc>
+        <w:tc>
+          <w:tcPr>
+            <w:tcW w:type="dxa" w:w="1134"/>
+          </w:tcPr>
+          <w:p>
+            <w:pPr>
+              <w:spacing w:after="40" w:before="40"/>
+              <w:jc w:val="right"/>
+            </w:pPr>
+            <w:r>
+              <w:t>(1)</w:t>
+            </w:r>
+          </w:p>
+        </w:tc>
+      </w:tr>
+    </w:tbl>
+    <w:p>
+      <w:pPr>
+        <w:spacing w:after="120"/>
+        <w:jc w:val="both"/>
+      </w:pPr>
       <w:r>
-        <w:rPr>
-          <w:b w:val="0"/>
-          <w:i/>
-        </w:rPr>
-        <w:t>S</w:t>
+        <w:t xml:space="preserve">bu yerda </w:t>
       </w:r>
-      <w:r>
-        <w:rPr>
-          <w:b w:val="0"/>
-          <w:i/>
-        </w:rPr>
-        <w:t>sol</w:t>
-      </w:r>
-      <w:r>
-        <w:rPr>
-          <w:b/>
-          <w:i w:val="0"/>
-        </w:rPr>
-        <w:t xml:space="preserve"> = 6/(ρ·d)</w:t>
-      </w:r>
+      <m:oMath>
+        <m:r>
+          <m:t xml:space="preserve">ρ</m:t>
+        </m:r>
+      </m:oMath>
       <w:r>
         <w:rPr>
           <w:b w:val="0"/>
           <w:i w:val="0"/>
         </w:rPr>
-        <w:t xml:space="preserve"> ifodasi bilan aniqlanadi: diametr 1 mkm dan 10 nm gacha kichraysa, sirt 100 marta ortadi (masalan, Au uchun ≈ 0,3 → 31 m²/g). Sirt atomlarining koordinatsion to'yinmaganligi ortiqcha Gibbs sirt energiyasini (</w:t>
+        <w:t xml:space="preserve"> — zarracha zichligi, </w:t>
       </w:r>
-      <w:r>
-        <w:rPr>
-          <w:b w:val="0"/>
-          <w:i/>
-        </w:rPr>
-        <w:t>G</w:t>
-      </w:r>
-      <w:r>
-        <w:rPr>
-          <w:b w:val="0"/>
-          <w:i/>
-        </w:rPr>
-        <w:t>s</w:t>
-      </w:r>
-      <w:r>
-        <w:rPr>
-          <w:b/>
-          <w:i w:val="0"/>
-        </w:rPr>
-        <w:t xml:space="preserve"> = σ·S</w:t>
-      </w:r>
+      <m:oMath>
+        <m:r>
+          <m:t xml:space="preserve">d</m:t>
+        </m:r>
+      </m:oMath>
       <w:r>
         <w:rPr>
           <w:b w:val="0"/>
           <w:i w:val="0"/>
         </w:rPr>
-        <w:t>) yuzaga keltiradi — aynan shu energiya nanokolloidlarning termodinamik beqarorligi (agregatsiya, Ostvald yetilishi) va yuqori reaksion qobiliyatining manbaidir.</w:t>
+        <w:t xml:space="preserve"> — zarracha diametri.</w:t>
+      </w:r>
+    </w:p>
+    <w:p>
+      <w:pPr>
+        <w:jc w:val="both"/>
+      </w:pPr>
+      <w:r>
+        <w:rPr>
+          <w:b w:val="0"/>
+          <w:i w:val="0"/>
+        </w:rPr>
+        <w:t>Diametr 1 mkm dan 10 nm gacha kichraysa, solishtirma sirt 100 marta ortadi (Au uchun ≈ 0,3 → 31 m²/g). Sirt atomlarining koordinatsion to'yinmaganligi ortiqcha sirt Gibbs energiyasini yuzaga keltiradi:</w:t>
+      </w:r>
+    </w:p>
+    <w:tbl>
+      <w:tblPr>
+        <w:tblW w:type="auto" w:w="0"/>
+        <w:jc w:val="center"/>
+        <w:tblLook w:firstColumn="1" w:firstRow="1" w:lastColumn="0" w:lastRow="0" w:noHBand="0" w:noVBand="1" w:val="04A0"/>
+      </w:tblPr>
+      <w:tblGrid>
+        <w:gridCol w:w="4986"/>
+        <w:gridCol w:w="4986"/>
+      </w:tblGrid>
+      <w:tr>
+        <w:tc>
+          <w:tcPr>
+            <w:tcW w:type="dxa" w:w="8220"/>
+          </w:tcPr>
+          <w:p>
+            <w:pPr>
+              <w:spacing w:after="40" w:before="40"/>
+              <w:jc w:val="center"/>
+            </w:pPr>
+            <m:oMath>
+              <m:sSub>
+                <m:e>
+                  <m:r>
+                    <m:t xml:space="preserve">G</m:t>
+                  </m:r>
+                </m:e>
+                <m:sub>
+                  <m:r>
+                    <m:t xml:space="preserve">s</m:t>
+                  </m:r>
+                </m:sub>
+              </m:sSub>
+              <m:r>
+                <m:rPr>
+                  <m:sty m:val="p"/>
+                </m:rPr>
+                <m:t xml:space="preserve"> = </m:t>
+              </m:r>
+              <m:r>
+                <m:t xml:space="preserve">σ</m:t>
+              </m:r>
+              <m:r>
+                <m:rPr>
+                  <m:sty m:val="p"/>
+                </m:rPr>
+                <m:t xml:space="preserve">·</m:t>
+              </m:r>
+              <m:r>
+                <m:t xml:space="preserve">S</m:t>
+              </m:r>
+            </m:oMath>
+          </w:p>
+        </w:tc>
+        <w:tc>
+          <w:tcPr>
+            <w:tcW w:type="dxa" w:w="1134"/>
+          </w:tcPr>
+          <w:p>
+            <w:pPr>
+              <w:spacing w:after="40" w:before="40"/>
+              <w:jc w:val="right"/>
+            </w:pPr>
+            <w:r>
+              <w:t>(2)</w:t>
+            </w:r>
+          </w:p>
+        </w:tc>
+      </w:tr>
+    </w:tbl>
+    <w:p>
+      <w:pPr>
+        <w:spacing w:after="120"/>
+        <w:jc w:val="both"/>
+      </w:pPr>
+      <w:r>
+        <w:t xml:space="preserve">bu yerda </w:t>
+      </w:r>
+      <m:oMath>
+        <m:r>
+          <m:t xml:space="preserve">σ</m:t>
+        </m:r>
+      </m:oMath>
+      <w:r>
+        <w:rPr>
+          <w:b w:val="0"/>
+          <w:i w:val="0"/>
+        </w:rPr>
+        <w:t xml:space="preserve"> — sirt tarangligi (solishtirma sirt energiyasi), </w:t>
+      </w:r>
+      <m:oMath>
+        <m:r>
+          <m:t xml:space="preserve">S</m:t>
+        </m:r>
+      </m:oMath>
+      <w:r>
+        <w:rPr>
+          <w:b w:val="0"/>
+          <w:i w:val="0"/>
+        </w:rPr>
+        <w:t xml:space="preserve"> — umumiy fazalararo sirt.</w:t>
+      </w:r>
+    </w:p>
+    <w:p>
+      <w:pPr>
+        <w:jc w:val="both"/>
+      </w:pPr>
+      <w:r>
+        <w:rPr>
+          <w:b w:val="0"/>
+          <w:i w:val="0"/>
+        </w:rPr>
+        <w:t>Aynan shu energiya nanokolloidlarning termodinamik beqarorligi (agregatsiya, Ostvald yetilishi) va yuqori reaksion qobiliyatining manbaidir: sistema o'z-o'zidan sirtni kamaytirishga intiladi.</w:t>
       </w:r>
     </w:p>
     <w:p>
@@ -384,7 +568,1298 @@
           <w:b/>
           <w:i w:val="0"/>
         </w:rPr>
-        <w:t>Termodinamik va kinetik o'lcham effektlari:</w:t>
+        <w:t>Termodinamik o'lcham effektlari.</w:t>
+      </w:r>
+    </w:p>
+    <w:p>
+      <w:pPr>
+        <w:jc w:val="both"/>
+      </w:pPr>
+      <w:r>
+        <w:rPr>
+          <w:b/>
+          <w:i w:val="0"/>
+        </w:rPr>
+        <w:t xml:space="preserve">Eruvchanlik. </w:t>
+      </w:r>
+      <w:r>
+        <w:rPr>
+          <w:b w:val="0"/>
+          <w:i w:val="0"/>
+        </w:rPr>
+        <w:t>Egri sirt ustidagi kimyoviy potensial yassi sirtdagidan yuqori bo'lgani uchun kichik zarrachaning eruvchanligi Ostvald–Freyndlix tenglamasi bo'yicha ortadi:</w:t>
+      </w:r>
+    </w:p>
+    <w:tbl>
+      <w:tblPr>
+        <w:tblW w:type="auto" w:w="0"/>
+        <w:jc w:val="center"/>
+        <w:tblLook w:firstColumn="1" w:firstRow="1" w:lastColumn="0" w:lastRow="0" w:noHBand="0" w:noVBand="1" w:val="04A0"/>
+      </w:tblPr>
+      <w:tblGrid>
+        <w:gridCol w:w="4986"/>
+        <w:gridCol w:w="4986"/>
+      </w:tblGrid>
+      <w:tr>
+        <w:tc>
+          <w:tcPr>
+            <w:tcW w:type="dxa" w:w="8220"/>
+          </w:tcPr>
+          <w:p>
+            <w:pPr>
+              <w:spacing w:after="40" w:before="40"/>
+              <w:jc w:val="center"/>
+            </w:pPr>
+            <m:oMath>
+              <m:r>
+                <m:rPr>
+                  <m:sty m:val="p"/>
+                </m:rPr>
+                <m:t xml:space="preserve">ln</m:t>
+              </m:r>
+              <m:f>
+                <m:num>
+                  <m:sSub>
+                    <m:e>
+                      <m:r>
+                        <m:t xml:space="preserve">c</m:t>
+                      </m:r>
+                    </m:e>
+                    <m:sub>
+                      <m:r>
+                        <m:t xml:space="preserve">r</m:t>
+                      </m:r>
+                    </m:sub>
+                  </m:sSub>
+                </m:num>
+                <m:den>
+                  <m:sSub>
+                    <m:e>
+                      <m:r>
+                        <m:t xml:space="preserve">c</m:t>
+                      </m:r>
+                    </m:e>
+                    <m:sub>
+                      <m:r>
+                        <m:t xml:space="preserve">∞</m:t>
+                      </m:r>
+                    </m:sub>
+                  </m:sSub>
+                </m:den>
+              </m:f>
+              <m:r>
+                <m:rPr>
+                  <m:sty m:val="p"/>
+                </m:rPr>
+                <m:t xml:space="preserve"> = </m:t>
+              </m:r>
+              <m:f>
+                <m:num>
+                  <m:r>
+                    <m:rPr>
+                      <m:sty m:val="p"/>
+                    </m:rPr>
+                    <m:t xml:space="preserve">2</m:t>
+                  </m:r>
+                  <m:r>
+                    <m:t xml:space="preserve">σ</m:t>
+                  </m:r>
+                  <m:sSub>
+                    <m:e>
+                      <m:r>
+                        <m:t xml:space="preserve">V</m:t>
+                      </m:r>
+                    </m:e>
+                    <m:sub>
+                      <m:r>
+                        <m:t xml:space="preserve">m</m:t>
+                      </m:r>
+                    </m:sub>
+                  </m:sSub>
+                </m:num>
+                <m:den>
+                  <m:r>
+                    <m:t xml:space="preserve">R</m:t>
+                  </m:r>
+                  <m:r>
+                    <m:t xml:space="preserve">T</m:t>
+                  </m:r>
+                  <m:r>
+                    <m:t xml:space="preserve">r</m:t>
+                  </m:r>
+                </m:den>
+              </m:f>
+            </m:oMath>
+          </w:p>
+        </w:tc>
+        <w:tc>
+          <w:tcPr>
+            <w:tcW w:type="dxa" w:w="1134"/>
+          </w:tcPr>
+          <w:p>
+            <w:pPr>
+              <w:spacing w:after="40" w:before="40"/>
+              <w:jc w:val="right"/>
+            </w:pPr>
+            <w:r>
+              <w:t>(3)</w:t>
+            </w:r>
+          </w:p>
+        </w:tc>
+      </w:tr>
+    </w:tbl>
+    <w:p>
+      <w:pPr>
+        <w:spacing w:after="120"/>
+        <w:jc w:val="both"/>
+      </w:pPr>
+      <w:r>
+        <w:t xml:space="preserve">bu yerda </w:t>
+      </w:r>
+      <m:oMath>
+        <m:sSub>
+          <m:e>
+            <m:r>
+              <m:t xml:space="preserve">c</m:t>
+            </m:r>
+          </m:e>
+          <m:sub>
+            <m:r>
+              <m:t xml:space="preserve">r</m:t>
+            </m:r>
+          </m:sub>
+        </m:sSub>
+      </m:oMath>
+      <w:r>
+        <w:rPr>
+          <w:b w:val="0"/>
+          <w:i w:val="0"/>
+        </w:rPr>
+        <w:t xml:space="preserve"> va </w:t>
+      </w:r>
+      <m:oMath>
+        <m:sSub>
+          <m:e>
+            <m:r>
+              <m:t xml:space="preserve">c</m:t>
+            </m:r>
+          </m:e>
+          <m:sub>
+            <m:r>
+              <m:t xml:space="preserve">∞</m:t>
+            </m:r>
+          </m:sub>
+        </m:sSub>
+      </m:oMath>
+      <w:r>
+        <w:rPr>
+          <w:b w:val="0"/>
+          <w:i w:val="0"/>
+        </w:rPr>
+        <w:t xml:space="preserve"> — radiusi r bo'lgan zarracha va yassi sirt uchun eruvchanlik, </w:t>
+      </w:r>
+      <m:oMath>
+        <m:sSub>
+          <m:e>
+            <m:r>
+              <m:t xml:space="preserve">V</m:t>
+            </m:r>
+          </m:e>
+          <m:sub>
+            <m:r>
+              <m:t xml:space="preserve">m</m:t>
+            </m:r>
+          </m:sub>
+        </m:sSub>
+      </m:oMath>
+      <w:r>
+        <w:rPr>
+          <w:b w:val="0"/>
+          <w:i w:val="0"/>
+        </w:rPr>
+        <w:t xml:space="preserve"> — molyar hajm, </w:t>
+      </w:r>
+      <m:oMath>
+        <m:r>
+          <m:t xml:space="preserve">r</m:t>
+        </m:r>
+      </m:oMath>
+      <w:r>
+        <w:rPr>
+          <w:b w:val="0"/>
+          <w:i w:val="0"/>
+        </w:rPr>
+        <w:t xml:space="preserve"> — zarracha radiusi.</w:t>
+      </w:r>
+    </w:p>
+    <w:p>
+      <w:pPr>
+        <w:jc w:val="both"/>
+      </w:pPr>
+      <w:r>
+        <w:rPr>
+          <w:b w:val="0"/>
+          <w:i w:val="0"/>
+        </w:rPr>
+        <w:t>Natijada polidispers sistemada kichik zarrachalar eriydi, yiriklari o'sadi — Ostvald yetilishi sodir bo'ladi.</w:t>
+      </w:r>
+    </w:p>
+    <w:p>
+      <w:pPr>
+        <w:jc w:val="both"/>
+      </w:pPr>
+      <w:r>
+        <w:rPr>
+          <w:b/>
+          <w:i w:val="0"/>
+        </w:rPr>
+        <w:t xml:space="preserve">Erish harorati. </w:t>
+      </w:r>
+      <w:r>
+        <w:rPr>
+          <w:b w:val="0"/>
+          <w:i w:val="0"/>
+        </w:rPr>
+        <w:t>Gibbs–Tomson tenglamasiga ko'ra nanozarrachaning erish harorati massiv moddanikidan past bo'ladi:</w:t>
+      </w:r>
+    </w:p>
+    <w:tbl>
+      <w:tblPr>
+        <w:tblW w:type="auto" w:w="0"/>
+        <w:jc w:val="center"/>
+        <w:tblLook w:firstColumn="1" w:firstRow="1" w:lastColumn="0" w:lastRow="0" w:noHBand="0" w:noVBand="1" w:val="04A0"/>
+      </w:tblPr>
+      <w:tblGrid>
+        <w:gridCol w:w="4986"/>
+        <w:gridCol w:w="4986"/>
+      </w:tblGrid>
+      <w:tr>
+        <w:tc>
+          <w:tcPr>
+            <w:tcW w:type="dxa" w:w="8220"/>
+          </w:tcPr>
+          <w:p>
+            <w:pPr>
+              <w:spacing w:after="40" w:before="40"/>
+              <w:jc w:val="center"/>
+            </w:pPr>
+            <m:oMath>
+              <m:r>
+                <m:t xml:space="preserve">Δ</m:t>
+              </m:r>
+              <m:sSub>
+                <m:e>
+                  <m:r>
+                    <m:t xml:space="preserve">T</m:t>
+                  </m:r>
+                </m:e>
+                <m:sub>
+                  <m:r>
+                    <m:t xml:space="preserve">m</m:t>
+                  </m:r>
+                </m:sub>
+              </m:sSub>
+              <m:r>
+                <m:rPr>
+                  <m:sty m:val="p"/>
+                </m:rPr>
+                <m:t xml:space="preserve"> = </m:t>
+              </m:r>
+              <m:sSubSup>
+                <m:e>
+                  <m:r>
+                    <m:t xml:space="preserve">T</m:t>
+                  </m:r>
+                </m:e>
+                <m:sub>
+                  <m:r>
+                    <m:t xml:space="preserve">m</m:t>
+                  </m:r>
+                </m:sub>
+                <m:sup>
+                  <m:r>
+                    <m:t xml:space="preserve">∞</m:t>
+                  </m:r>
+                </m:sup>
+              </m:sSubSup>
+              <m:r>
+                <m:rPr>
+                  <m:sty m:val="p"/>
+                </m:rPr>
+                <m:t xml:space="preserve"> − </m:t>
+              </m:r>
+              <m:sSub>
+                <m:e>
+                  <m:r>
+                    <m:t xml:space="preserve">T</m:t>
+                  </m:r>
+                </m:e>
+                <m:sub>
+                  <m:r>
+                    <m:t xml:space="preserve">m</m:t>
+                  </m:r>
+                </m:sub>
+              </m:sSub>
+              <m:d>
+                <m:dPr>
+                  <m:begChr m:val="("/>
+                  <m:endChr m:val=")"/>
+                </m:dPr>
+                <m:e>
+                  <m:r>
+                    <m:t xml:space="preserve">r</m:t>
+                  </m:r>
+                </m:e>
+              </m:d>
+              <m:r>
+                <m:rPr>
+                  <m:sty m:val="p"/>
+                </m:rPr>
+                <m:t xml:space="preserve"> = </m:t>
+              </m:r>
+              <m:f>
+                <m:num>
+                  <m:r>
+                    <m:rPr>
+                      <m:sty m:val="p"/>
+                    </m:rPr>
+                    <m:t xml:space="preserve">2</m:t>
+                  </m:r>
+                  <m:sSub>
+                    <m:e>
+                      <m:r>
+                        <m:t xml:space="preserve">σ</m:t>
+                      </m:r>
+                    </m:e>
+                    <m:sub>
+                      <m:r>
+                        <m:rPr>
+                          <m:sty m:val="p"/>
+                        </m:rPr>
+                        <m:t xml:space="preserve">sl</m:t>
+                      </m:r>
+                    </m:sub>
+                  </m:sSub>
+                  <m:sSubSup>
+                    <m:e>
+                      <m:r>
+                        <m:t xml:space="preserve">T</m:t>
+                      </m:r>
+                    </m:e>
+                    <m:sub>
+                      <m:r>
+                        <m:t xml:space="preserve">m</m:t>
+                      </m:r>
+                    </m:sub>
+                    <m:sup>
+                      <m:r>
+                        <m:t xml:space="preserve">∞</m:t>
+                      </m:r>
+                    </m:sup>
+                  </m:sSubSup>
+                </m:num>
+                <m:den>
+                  <m:r>
+                    <m:t xml:space="preserve">Δ</m:t>
+                  </m:r>
+                  <m:sSub>
+                    <m:e>
+                      <m:r>
+                        <m:t xml:space="preserve">H</m:t>
+                      </m:r>
+                    </m:e>
+                    <m:sub>
+                      <m:r>
+                        <m:t xml:space="preserve">m</m:t>
+                      </m:r>
+                    </m:sub>
+                  </m:sSub>
+                  <m:sSub>
+                    <m:e>
+                      <m:r>
+                        <m:t xml:space="preserve">ρ</m:t>
+                      </m:r>
+                    </m:e>
+                    <m:sub>
+                      <m:r>
+                        <m:t xml:space="preserve">s</m:t>
+                      </m:r>
+                    </m:sub>
+                  </m:sSub>
+                  <m:r>
+                    <m:t xml:space="preserve">r</m:t>
+                  </m:r>
+                </m:den>
+              </m:f>
+            </m:oMath>
+          </w:p>
+        </w:tc>
+        <w:tc>
+          <w:tcPr>
+            <w:tcW w:type="dxa" w:w="1134"/>
+          </w:tcPr>
+          <w:p>
+            <w:pPr>
+              <w:spacing w:after="40" w:before="40"/>
+              <w:jc w:val="right"/>
+            </w:pPr>
+            <w:r>
+              <w:t>(4)</w:t>
+            </w:r>
+          </w:p>
+        </w:tc>
+      </w:tr>
+    </w:tbl>
+    <w:p>
+      <w:pPr>
+        <w:spacing w:after="120"/>
+        <w:jc w:val="both"/>
+      </w:pPr>
+      <w:r>
+        <w:t xml:space="preserve">bu yerda </w:t>
+      </w:r>
+      <m:oMath>
+        <m:sSubSup>
+          <m:e>
+            <m:r>
+              <m:t xml:space="preserve">T</m:t>
+            </m:r>
+          </m:e>
+          <m:sub>
+            <m:r>
+              <m:t xml:space="preserve">m</m:t>
+            </m:r>
+          </m:sub>
+          <m:sup>
+            <m:r>
+              <m:t xml:space="preserve">∞</m:t>
+            </m:r>
+          </m:sup>
+        </m:sSubSup>
+      </m:oMath>
+      <w:r>
+        <w:rPr>
+          <w:b w:val="0"/>
+          <w:i w:val="0"/>
+        </w:rPr>
+        <w:t xml:space="preserve"> — massiv modda erish harorati, </w:t>
+      </w:r>
+      <m:oMath>
+        <m:sSub>
+          <m:e>
+            <m:r>
+              <m:t xml:space="preserve">σ</m:t>
+            </m:r>
+          </m:e>
+          <m:sub>
+            <m:r>
+              <m:rPr>
+                <m:sty m:val="p"/>
+              </m:rPr>
+              <m:t xml:space="preserve">sl</m:t>
+            </m:r>
+          </m:sub>
+        </m:sSub>
+      </m:oMath>
+      <w:r>
+        <w:rPr>
+          <w:b w:val="0"/>
+          <w:i w:val="0"/>
+        </w:rPr>
+        <w:t xml:space="preserve"> — qattiq–suyuqlik sirt tarangligi, </w:t>
+      </w:r>
+      <m:oMath>
+        <m:r>
+          <m:t xml:space="preserve">Δ</m:t>
+        </m:r>
+        <m:sSub>
+          <m:e>
+            <m:r>
+              <m:t xml:space="preserve">H</m:t>
+            </m:r>
+          </m:e>
+          <m:sub>
+            <m:r>
+              <m:t xml:space="preserve">m</m:t>
+            </m:r>
+          </m:sub>
+        </m:sSub>
+      </m:oMath>
+      <w:r>
+        <w:rPr>
+          <w:b w:val="0"/>
+          <w:i w:val="0"/>
+        </w:rPr>
+        <w:t xml:space="preserve"> — solishtirma erish issiqligi.</w:t>
+      </w:r>
+    </w:p>
+    <w:p>
+      <w:pPr>
+        <w:jc w:val="both"/>
+      </w:pPr>
+      <w:r>
+        <w:rPr>
+          <w:b w:val="0"/>
+          <w:i w:val="0"/>
+        </w:rPr>
+        <w:t>Masalan, 2–3 nm li Au zarrachalar ≈ 600 K da eriydi (massiv Au: 1337 K).</w:t>
+      </w:r>
+    </w:p>
+    <w:p>
+      <w:pPr>
+        <w:spacing w:after="40"/>
+      </w:pPr>
+      <w:r>
+        <w:rPr>
+          <w:b/>
+          <w:i w:val="0"/>
+        </w:rPr>
+        <w:t>Kinetik o'lcham effektlari.</w:t>
+      </w:r>
+    </w:p>
+    <w:p>
+      <w:pPr>
+        <w:jc w:val="both"/>
+      </w:pPr>
+      <w:r>
+        <w:rPr>
+          <w:b/>
+          <w:i w:val="0"/>
+        </w:rPr>
+        <w:t xml:space="preserve">Sedimentatsiya va Broun harakati. </w:t>
+      </w:r>
+      <w:r>
+        <w:rPr>
+          <w:b w:val="0"/>
+          <w:i w:val="0"/>
+        </w:rPr>
+        <w:t>Stoks qonuniga ko'ra cho'kish tezligi radius kvadratiga, Stoks–Eynshteyn tenglamasiga ko'ra diffuziya koeffitsienti esa radiusga teskari proporsional:</w:t>
+      </w:r>
+    </w:p>
+    <w:tbl>
+      <w:tblPr>
+        <w:tblW w:type="auto" w:w="0"/>
+        <w:jc w:val="center"/>
+        <w:tblLook w:firstColumn="1" w:firstRow="1" w:lastColumn="0" w:lastRow="0" w:noHBand="0" w:noVBand="1" w:val="04A0"/>
+      </w:tblPr>
+      <w:tblGrid>
+        <w:gridCol w:w="4986"/>
+        <w:gridCol w:w="4986"/>
+      </w:tblGrid>
+      <w:tr>
+        <w:tc>
+          <w:tcPr>
+            <w:tcW w:type="dxa" w:w="8220"/>
+          </w:tcPr>
+          <w:p>
+            <w:pPr>
+              <w:spacing w:after="40" w:before="40"/>
+              <w:jc w:val="center"/>
+            </w:pPr>
+            <m:oMath>
+              <m:r>
+                <m:t xml:space="preserve">v</m:t>
+              </m:r>
+              <m:r>
+                <m:rPr>
+                  <m:sty m:val="p"/>
+                </m:rPr>
+                <m:t xml:space="preserve"> = </m:t>
+              </m:r>
+              <m:f>
+                <m:num>
+                  <m:r>
+                    <m:rPr>
+                      <m:sty m:val="p"/>
+                    </m:rPr>
+                    <m:t xml:space="preserve">2</m:t>
+                  </m:r>
+                  <m:sSup>
+                    <m:e>
+                      <m:r>
+                        <m:t xml:space="preserve">r</m:t>
+                      </m:r>
+                    </m:e>
+                    <m:sup>
+                      <m:r>
+                        <m:rPr>
+                          <m:sty m:val="p"/>
+                        </m:rPr>
+                        <m:t xml:space="preserve">2</m:t>
+                      </m:r>
+                    </m:sup>
+                  </m:sSup>
+                  <m:d>
+                    <m:dPr>
+                      <m:begChr m:val="("/>
+                      <m:endChr m:val=")"/>
+                    </m:dPr>
+                    <m:e>
+                      <m:r>
+                        <m:t xml:space="preserve">ρ</m:t>
+                      </m:r>
+                      <m:r>
+                        <m:rPr>
+                          <m:sty m:val="p"/>
+                        </m:rPr>
+                        <m:t xml:space="preserve"> − </m:t>
+                      </m:r>
+                      <m:sSub>
+                        <m:e>
+                          <m:r>
+                            <m:t xml:space="preserve">ρ</m:t>
+                          </m:r>
+                        </m:e>
+                        <m:sub>
+                          <m:r>
+                            <m:rPr>
+                              <m:sty m:val="p"/>
+                            </m:rPr>
+                            <m:t xml:space="preserve">0</m:t>
+                          </m:r>
+                        </m:sub>
+                      </m:sSub>
+                    </m:e>
+                  </m:d>
+                  <m:r>
+                    <m:t xml:space="preserve">g</m:t>
+                  </m:r>
+                </m:num>
+                <m:den>
+                  <m:r>
+                    <m:rPr>
+                      <m:sty m:val="p"/>
+                    </m:rPr>
+                    <m:t xml:space="preserve">9</m:t>
+                  </m:r>
+                  <m:r>
+                    <m:t xml:space="preserve">η</m:t>
+                  </m:r>
+                </m:den>
+              </m:f>
+            </m:oMath>
+          </w:p>
+        </w:tc>
+        <w:tc>
+          <w:tcPr>
+            <w:tcW w:type="dxa" w:w="1134"/>
+          </w:tcPr>
+          <w:p>
+            <w:pPr>
+              <w:spacing w:after="40" w:before="40"/>
+              <w:jc w:val="right"/>
+            </w:pPr>
+            <w:r>
+              <w:t>(5)</w:t>
+            </w:r>
+          </w:p>
+        </w:tc>
+      </w:tr>
+    </w:tbl>
+    <w:tbl>
+      <w:tblPr>
+        <w:tblW w:type="auto" w:w="0"/>
+        <w:jc w:val="center"/>
+        <w:tblLook w:firstColumn="1" w:firstRow="1" w:lastColumn="0" w:lastRow="0" w:noHBand="0" w:noVBand="1" w:val="04A0"/>
+      </w:tblPr>
+      <w:tblGrid>
+        <w:gridCol w:w="4986"/>
+        <w:gridCol w:w="4986"/>
+      </w:tblGrid>
+      <w:tr>
+        <w:tc>
+          <w:tcPr>
+            <w:tcW w:type="dxa" w:w="8220"/>
+          </w:tcPr>
+          <w:p>
+            <w:pPr>
+              <w:spacing w:after="40" w:before="40"/>
+              <w:jc w:val="center"/>
+            </w:pPr>
+            <m:oMath>
+              <m:r>
+                <m:t xml:space="preserve">D</m:t>
+              </m:r>
+              <m:r>
+                <m:rPr>
+                  <m:sty m:val="p"/>
+                </m:rPr>
+                <m:t xml:space="preserve"> = </m:t>
+              </m:r>
+              <m:f>
+                <m:num>
+                  <m:sSub>
+                    <m:e>
+                      <m:r>
+                        <m:t xml:space="preserve">k</m:t>
+                      </m:r>
+                    </m:e>
+                    <m:sub>
+                      <m:r>
+                        <m:rPr>
+                          <m:sty m:val="p"/>
+                        </m:rPr>
+                        <m:t xml:space="preserve">B</m:t>
+                      </m:r>
+                    </m:sub>
+                  </m:sSub>
+                  <m:r>
+                    <m:t xml:space="preserve">T</m:t>
+                  </m:r>
+                </m:num>
+                <m:den>
+                  <m:r>
+                    <m:rPr>
+                      <m:sty m:val="p"/>
+                    </m:rPr>
+                    <m:t xml:space="preserve">6</m:t>
+                  </m:r>
+                  <m:r>
+                    <m:t xml:space="preserve">π</m:t>
+                  </m:r>
+                  <m:r>
+                    <m:t xml:space="preserve">η</m:t>
+                  </m:r>
+                  <m:r>
+                    <m:t xml:space="preserve">r</m:t>
+                  </m:r>
+                </m:den>
+              </m:f>
+            </m:oMath>
+          </w:p>
+        </w:tc>
+        <w:tc>
+          <w:tcPr>
+            <w:tcW w:type="dxa" w:w="1134"/>
+          </w:tcPr>
+          <w:p>
+            <w:pPr>
+              <w:spacing w:after="40" w:before="40"/>
+              <w:jc w:val="right"/>
+            </w:pPr>
+            <w:r>
+              <w:t>(6)</w:t>
+            </w:r>
+          </w:p>
+        </w:tc>
+      </w:tr>
+    </w:tbl>
+    <w:p>
+      <w:pPr>
+        <w:spacing w:after="120"/>
+        <w:jc w:val="both"/>
+      </w:pPr>
+      <w:r>
+        <w:t xml:space="preserve">bu yerda </w:t>
+      </w:r>
+      <m:oMath>
+        <m:r>
+          <m:t xml:space="preserve">η</m:t>
+        </m:r>
+      </m:oMath>
+      <w:r>
+        <w:rPr>
+          <w:b w:val="0"/>
+          <w:i w:val="0"/>
+        </w:rPr>
+        <w:t xml:space="preserve"> — dispers muhit qovushqoqligi, </w:t>
+      </w:r>
+      <m:oMath>
+        <m:sSub>
+          <m:e>
+            <m:r>
+              <m:t xml:space="preserve">ρ</m:t>
+            </m:r>
+          </m:e>
+          <m:sub>
+            <m:r>
+              <m:rPr>
+                <m:sty m:val="p"/>
+              </m:rPr>
+              <m:t xml:space="preserve">0</m:t>
+            </m:r>
+          </m:sub>
+        </m:sSub>
+      </m:oMath>
+      <w:r>
+        <w:rPr>
+          <w:b w:val="0"/>
+          <w:i w:val="0"/>
+        </w:rPr>
+        <w:t xml:space="preserve"> — muhit zichligi, </w:t>
+      </w:r>
+      <m:oMath>
+        <m:sSub>
+          <m:e>
+            <m:r>
+              <m:t xml:space="preserve">k</m:t>
+            </m:r>
+          </m:e>
+          <m:sub>
+            <m:r>
+              <m:rPr>
+                <m:sty m:val="p"/>
+              </m:rPr>
+              <m:t xml:space="preserve">B</m:t>
+            </m:r>
+          </m:sub>
+        </m:sSub>
+      </m:oMath>
+      <w:r>
+        <w:rPr>
+          <w:b w:val="0"/>
+          <w:i w:val="0"/>
+        </w:rPr>
+        <w:t xml:space="preserve"> — Bolsman doimiysi.</w:t>
+      </w:r>
+    </w:p>
+    <w:p>
+      <w:pPr>
+        <w:jc w:val="both"/>
+      </w:pPr>
+      <w:r>
+        <w:rPr>
+          <w:b w:val="0"/>
+          <w:i w:val="0"/>
+        </w:rPr>
+        <w:t>10 nm li zarrachalar uchun Broun harakati gravitatsiyadan ustun bo'lgani uchun sistema kinetik jihatdan cho'kmaydi (sedimentatsion barqaror).</w:t>
+      </w:r>
+    </w:p>
+    <w:p>
+      <w:pPr>
+        <w:spacing w:after="40"/>
+      </w:pPr>
+      <w:r>
+        <w:rPr>
+          <w:b/>
+          <w:i w:val="0"/>
+        </w:rPr>
+        <w:t>Kvant va kollektiv effektlar.</w:t>
+      </w:r>
+    </w:p>
+    <w:p>
+      <w:pPr>
+        <w:jc w:val="both"/>
+      </w:pPr>
+      <w:r>
+        <w:rPr>
+          <w:b/>
+          <w:i w:val="0"/>
+        </w:rPr>
+        <w:t xml:space="preserve">Kvant-o'lcham effekti. </w:t>
+      </w:r>
+      <w:r>
+        <w:rPr>
+          <w:b w:val="0"/>
+          <w:i w:val="0"/>
+        </w:rPr>
+        <w:t>Yarimo'tkazgich kvant nuqtalarda (CdSe, 2–8 nm) zarracha radiusi eksiton Bor radiusidan kichik bo'lsa, taqiqlangan zona kengligi Brus tenglamasi bo'yicha ortadi:</w:t>
+      </w:r>
+    </w:p>
+    <w:tbl>
+      <w:tblPr>
+        <w:tblW w:type="auto" w:w="0"/>
+        <w:jc w:val="center"/>
+        <w:tblLook w:firstColumn="1" w:firstRow="1" w:lastColumn="0" w:lastRow="0" w:noHBand="0" w:noVBand="1" w:val="04A0"/>
+      </w:tblPr>
+      <w:tblGrid>
+        <w:gridCol w:w="4986"/>
+        <w:gridCol w:w="4986"/>
+      </w:tblGrid>
+      <w:tr>
+        <w:tc>
+          <w:tcPr>
+            <w:tcW w:type="dxa" w:w="8220"/>
+          </w:tcPr>
+          <w:p>
+            <w:pPr>
+              <w:spacing w:after="40" w:before="40"/>
+              <w:jc w:val="center"/>
+            </w:pPr>
+            <m:oMath>
+              <m:sSub>
+                <m:e>
+                  <m:r>
+                    <m:t xml:space="preserve">E</m:t>
+                  </m:r>
+                </m:e>
+                <m:sub>
+                  <m:r>
+                    <m:t xml:space="preserve">g</m:t>
+                  </m:r>
+                </m:sub>
+              </m:sSub>
+              <m:d>
+                <m:dPr>
+                  <m:begChr m:val="("/>
+                  <m:endChr m:val=")"/>
+                </m:dPr>
+                <m:e>
+                  <m:r>
+                    <m:t xml:space="preserve">r</m:t>
+                  </m:r>
+                </m:e>
+              </m:d>
+              <m:r>
+                <m:rPr>
+                  <m:sty m:val="p"/>
+                </m:rPr>
+                <m:t xml:space="preserve"> = </m:t>
+              </m:r>
+              <m:sSubSup>
+                <m:e>
+                  <m:r>
+                    <m:t xml:space="preserve">E</m:t>
+                  </m:r>
+                </m:e>
+                <m:sub>
+                  <m:r>
+                    <m:t xml:space="preserve">g</m:t>
+                  </m:r>
+                </m:sub>
+                <m:sup>
+                  <m:r>
+                    <m:rPr>
+                      <m:sty m:val="p"/>
+                    </m:rPr>
+                    <m:t xml:space="preserve">bulk</m:t>
+                  </m:r>
+                </m:sup>
+              </m:sSubSup>
+              <m:r>
+                <m:rPr>
+                  <m:sty m:val="p"/>
+                </m:rPr>
+                <m:t xml:space="preserve"> + </m:t>
+              </m:r>
+              <m:f>
+                <m:num>
+                  <m:sSup>
+                    <m:e>
+                      <m:r>
+                        <m:t xml:space="preserve">ħ</m:t>
+                      </m:r>
+                    </m:e>
+                    <m:sup>
+                      <m:r>
+                        <m:rPr>
+                          <m:sty m:val="p"/>
+                        </m:rPr>
+                        <m:t xml:space="preserve">2</m:t>
+                      </m:r>
+                    </m:sup>
+                  </m:sSup>
+                  <m:sSup>
+                    <m:e>
+                      <m:r>
+                        <m:t xml:space="preserve">π</m:t>
+                      </m:r>
+                    </m:e>
+                    <m:sup>
+                      <m:r>
+                        <m:rPr>
+                          <m:sty m:val="p"/>
+                        </m:rPr>
+                        <m:t xml:space="preserve">2</m:t>
+                      </m:r>
+                    </m:sup>
+                  </m:sSup>
+                </m:num>
+                <m:den>
+                  <m:r>
+                    <m:rPr>
+                      <m:sty m:val="p"/>
+                    </m:rPr>
+                    <m:t xml:space="preserve">2</m:t>
+                  </m:r>
+                  <m:sSup>
+                    <m:e>
+                      <m:r>
+                        <m:t xml:space="preserve">r</m:t>
+                      </m:r>
+                    </m:e>
+                    <m:sup>
+                      <m:r>
+                        <m:rPr>
+                          <m:sty m:val="p"/>
+                        </m:rPr>
+                        <m:t xml:space="preserve">2</m:t>
+                      </m:r>
+                    </m:sup>
+                  </m:sSup>
+                </m:den>
+              </m:f>
+              <m:d>
+                <m:dPr>
+                  <m:begChr m:val="("/>
+                  <m:endChr m:val=")"/>
+                </m:dPr>
+                <m:e>
+                  <m:f>
+                    <m:num>
+                      <m:r>
+                        <m:rPr>
+                          <m:sty m:val="p"/>
+                        </m:rPr>
+                        <m:t xml:space="preserve">1</m:t>
+                      </m:r>
+                    </m:num>
+                    <m:den>
+                      <m:sSub>
+                        <m:e>
+                          <m:r>
+                            <m:t xml:space="preserve">m</m:t>
+                          </m:r>
+                        </m:e>
+                        <m:sub>
+                          <m:r>
+                            <m:t xml:space="preserve">e</m:t>
+                          </m:r>
+                        </m:sub>
+                      </m:sSub>
+                    </m:den>
+                  </m:f>
+                  <m:r>
+                    <m:rPr>
+                      <m:sty m:val="p"/>
+                    </m:rPr>
+                    <m:t xml:space="preserve"> + </m:t>
+                  </m:r>
+                  <m:f>
+                    <m:num>
+                      <m:r>
+                        <m:rPr>
+                          <m:sty m:val="p"/>
+                        </m:rPr>
+                        <m:t xml:space="preserve">1</m:t>
+                      </m:r>
+                    </m:num>
+                    <m:den>
+                      <m:sSub>
+                        <m:e>
+                          <m:r>
+                            <m:t xml:space="preserve">m</m:t>
+                          </m:r>
+                        </m:e>
+                        <m:sub>
+                          <m:r>
+                            <m:t xml:space="preserve">h</m:t>
+                          </m:r>
+                        </m:sub>
+                      </m:sSub>
+                    </m:den>
+                  </m:f>
+                </m:e>
+              </m:d>
+              <m:r>
+                <m:rPr>
+                  <m:sty m:val="p"/>
+                </m:rPr>
+                <m:t xml:space="preserve"> − </m:t>
+              </m:r>
+              <m:f>
+                <m:num>
+                  <m:r>
+                    <m:rPr>
+                      <m:sty m:val="p"/>
+                    </m:rPr>
+                    <m:t xml:space="preserve">1,8</m:t>
+                  </m:r>
+                  <m:sSup>
+                    <m:e>
+                      <m:r>
+                        <m:t xml:space="preserve">e</m:t>
+                      </m:r>
+                    </m:e>
+                    <m:sup>
+                      <m:r>
+                        <m:rPr>
+                          <m:sty m:val="p"/>
+                        </m:rPr>
+                        <m:t xml:space="preserve">2</m:t>
+                      </m:r>
+                    </m:sup>
+                  </m:sSup>
+                </m:num>
+                <m:den>
+                  <m:r>
+                    <m:rPr>
+                      <m:sty m:val="p"/>
+                    </m:rPr>
+                    <m:t xml:space="preserve">4</m:t>
+                  </m:r>
+                  <m:r>
+                    <m:t xml:space="preserve">π</m:t>
+                  </m:r>
+                  <m:r>
+                    <m:t xml:space="preserve">ε</m:t>
+                  </m:r>
+                  <m:sSub>
+                    <m:e>
+                      <m:r>
+                        <m:t xml:space="preserve">ε</m:t>
+                      </m:r>
+                    </m:e>
+                    <m:sub>
+                      <m:r>
+                        <m:rPr>
+                          <m:sty m:val="p"/>
+                        </m:rPr>
+                        <m:t xml:space="preserve">0</m:t>
+                      </m:r>
+                    </m:sub>
+                  </m:sSub>
+                  <m:r>
+                    <m:t xml:space="preserve">r</m:t>
+                  </m:r>
+                </m:den>
+              </m:f>
+            </m:oMath>
+          </w:p>
+        </w:tc>
+        <w:tc>
+          <w:tcPr>
+            <w:tcW w:type="dxa" w:w="1134"/>
+          </w:tcPr>
+          <w:p>
+            <w:pPr>
+              <w:spacing w:after="40" w:before="40"/>
+              <w:jc w:val="right"/>
+            </w:pPr>
+            <w:r>
+              <w:t>(7)</w:t>
+            </w:r>
+          </w:p>
+        </w:tc>
+      </w:tr>
+    </w:tbl>
+    <w:p>
+      <w:pPr>
+        <w:spacing w:after="120"/>
+        <w:jc w:val="both"/>
+      </w:pPr>
+      <w:r>
+        <w:t xml:space="preserve">bu yerda </w:t>
+      </w:r>
+      <m:oMath>
+        <m:sSub>
+          <m:e>
+            <m:r>
+              <m:t xml:space="preserve">m</m:t>
+            </m:r>
+          </m:e>
+          <m:sub>
+            <m:r>
+              <m:t xml:space="preserve">e</m:t>
+            </m:r>
+          </m:sub>
+        </m:sSub>
+      </m:oMath>
+      <w:r>
+        <w:rPr>
+          <w:b w:val="0"/>
+          <w:i w:val="0"/>
+        </w:rPr>
+        <w:t xml:space="preserve">, </w:t>
+      </w:r>
+      <m:oMath>
+        <m:sSub>
+          <m:e>
+            <m:r>
+              <m:t xml:space="preserve">m</m:t>
+            </m:r>
+          </m:e>
+          <m:sub>
+            <m:r>
+              <m:t xml:space="preserve">h</m:t>
+            </m:r>
+          </m:sub>
+        </m:sSub>
+      </m:oMath>
+      <w:r>
+        <w:rPr>
+          <w:b w:val="0"/>
+          <w:i w:val="0"/>
+        </w:rPr>
+        <w:t xml:space="preserve"> — elektron va kovakning effektiv massalari, </w:t>
+      </w:r>
+      <m:oMath>
+        <m:r>
+          <m:t xml:space="preserve">ε</m:t>
+        </m:r>
+      </m:oMath>
+      <w:r>
+        <w:rPr>
+          <w:b w:val="0"/>
+          <w:i w:val="0"/>
+        </w:rPr>
+        <w:t xml:space="preserve"> — dielektrik singdiruvchanlik.</w:t>
+      </w:r>
+    </w:p>
+    <w:p>
+      <w:pPr>
+        <w:jc w:val="both"/>
+      </w:pPr>
+      <w:r>
+        <w:rPr>
+          <w:b w:val="0"/>
+          <w:i w:val="0"/>
+        </w:rPr>
+        <w:t xml:space="preserve">Shunday qilib </w:t>
+      </w:r>
+      <m:oMath>
+        <m:sSub>
+          <m:e>
+            <m:r>
+              <m:t xml:space="preserve">E</m:t>
+            </m:r>
+          </m:e>
+          <m:sub>
+            <m:r>
+              <m:t xml:space="preserve">g</m:t>
+            </m:r>
+          </m:sub>
+        </m:sSub>
+        <m:r>
+          <m:rPr>
+            <m:sty m:val="p"/>
+          </m:rPr>
+          <m:t xml:space="preserve"> ∝ </m:t>
+        </m:r>
+        <m:f>
+          <m:num>
+            <m:r>
+              <m:rPr>
+                <m:sty m:val="p"/>
+              </m:rPr>
+              <m:t xml:space="preserve">1</m:t>
+            </m:r>
+          </m:num>
+          <m:den>
+            <m:sSup>
+              <m:e>
+                <m:r>
+                  <m:t xml:space="preserve">r</m:t>
+                </m:r>
+              </m:e>
+              <m:sup>
+                <m:r>
+                  <m:rPr>
+                    <m:sty m:val="p"/>
+                  </m:rPr>
+                  <m:t xml:space="preserve">2</m:t>
+                </m:r>
+              </m:sup>
+            </m:sSup>
+          </m:den>
+        </m:f>
+      </m:oMath>
+      <w:r>
+        <w:rPr>
+          <w:b w:val="0"/>
+          <w:i w:val="0"/>
+        </w:rPr>
+        <w:t xml:space="preserve"> — o'lcham kichraygan sari lyuminessensiya rangi qizildan ko'kka siljiydi.</w:t>
       </w:r>
     </w:p>
     <w:p>
@@ -397,10 +1872,10 @@
         <w:rPr>
           <w:b/>
         </w:rPr>
-        <w:t xml:space="preserve">Eruvchanlik (Ostvald–Freyndlix): </w:t>
+        <w:t xml:space="preserve">Sirt plazmon rezonansi (SPR): </w:t>
       </w:r>
       <w:r>
-        <w:t>ln(c_r/c_∞) = 2σV_m/(RT·r). Radius kichraygani sari eruvchanlik eksponensial ortadi — kichik zarrachalar eriydi, yiriklari o'sadi (Ostvald yetilishi).</w:t>
+        <w:t>Au nanozarrachalar 520 nm atrofida yutadi (qizil-binafsha rang); o'lcham ortishi va agregatsiya bilan cho'qqi qizil tomonga siljiydi — kolorimetrik sensorlar asosi.</w:t>
       </w:r>
     </w:p>
     <w:p>
@@ -413,26 +1888,10 @@
         <w:rPr>
           <w:b/>
         </w:rPr>
-        <w:t xml:space="preserve">Erish harorati (Gibbs–Tomson): </w:t>
+        <w:t xml:space="preserve">Superparamagnetizm: </w:t>
       </w:r>
       <w:r>
-        <w:t>ΔT_m ∝ 1/r. Masalan, 2–3 nm li Au zarrachalar ≈ 600 K da eriydi (massiv Au: 1337 K).</w:t>
-      </w:r>
-    </w:p>
-    <w:p>
-      <w:pPr>
-        <w:pStyle w:val="ListBullet"/>
-        <w:spacing w:after="40"/>
-        <w:jc w:val="both"/>
-      </w:pPr>
-      <w:r>
-        <w:rPr>
-          <w:b/>
-        </w:rPr>
-        <w:t xml:space="preserve">Sedimentatsiya (Stoks): </w:t>
-      </w:r>
-      <w:r>
-        <w:t>v = 2r²(ρ−ρ₀)g/(9η) ∝ r². 10 nm li zarrachalar uchun Broun harakati (D = kT/6πηr) gravitatsiyadan ustun — sistema kinetik jihatdan cho'kmaydi.</w:t>
+        <w:t>Fe₃O₄ zarrachalar ≈ 20 nm dan kichik bo'lsa bir domenli bo'lib, qoldiq magnitlanishsiz kuchli javob beradi (MRT kontrast, magnit ajratish).</w:t>
       </w:r>
     </w:p>
     <w:p>
@@ -448,67 +1907,7 @@
         <w:t xml:space="preserve">Katalitik faollik: </w:t>
       </w:r>
       <w:r>
-        <w:t>sirtdagi qirra va burchak atomlari ulushi ortadi; Au 3–5 nm da CO oksidlanishida faol, massiv holda inert.</w:t>
-      </w:r>
-    </w:p>
-    <w:p>
-      <w:pPr>
-        <w:spacing w:after="40"/>
-      </w:pPr>
-      <w:r>
-        <w:rPr>
-          <w:b/>
-          <w:i w:val="0"/>
-        </w:rPr>
-        <w:t>Kvant va kollektiv effektlar:</w:t>
-      </w:r>
-    </w:p>
-    <w:p>
-      <w:pPr>
-        <w:pStyle w:val="ListBullet"/>
-        <w:spacing w:after="40"/>
-        <w:jc w:val="both"/>
-      </w:pPr>
-      <w:r>
-        <w:rPr>
-          <w:b/>
-        </w:rPr>
-        <w:t xml:space="preserve">Kvant-o'lcham effekti: </w:t>
-      </w:r>
-      <w:r>
-        <w:t>yarimo'tkazgich kvant nuqtalarda (CdSe, 2–8 nm) taqiqlangan zona kengligi E_g ∝ 1/r² qonuniyat bilan ortadi — rang ko'kdan qizilga siljiydi.</w:t>
-      </w:r>
-    </w:p>
-    <w:p>
-      <w:pPr>
-        <w:pStyle w:val="ListBullet"/>
-        <w:spacing w:after="40"/>
-        <w:jc w:val="both"/>
-      </w:pPr>
-      <w:r>
-        <w:rPr>
-          <w:b/>
-        </w:rPr>
-        <w:t xml:space="preserve">Sirt plazmon rezonansi (SPR): </w:t>
-      </w:r>
-      <w:r>
-        <w:t>Au nanozarrachalar 520 nm atrofida yutadi (qizil-binafsha), o'lcham ortishi va agregatsiya bilan cho'qqi qizil tomonga siljiydi — kolorimetrik sensorlar asosi.</w:t>
-      </w:r>
-    </w:p>
-    <w:p>
-      <w:pPr>
-        <w:pStyle w:val="ListBullet"/>
-        <w:spacing w:after="40"/>
-        <w:jc w:val="both"/>
-      </w:pPr>
-      <w:r>
-        <w:rPr>
-          <w:b/>
-        </w:rPr>
-        <w:t xml:space="preserve">Superparamagnetizm: </w:t>
-      </w:r>
-      <w:r>
-        <w:t>Fe₃O₄ zarrachalar ~20 nm dan kichik bo'lsa bir domenli bo'lib, qoldiq magnitlanishsiz kuchli javob beradi (MRT kontrast, magnit ajratish).</w:t>
+        <w:t>qirra va burchak atomlari ulushi ortadi; Au 3–5 nm da CO oksidlanishida faol, massiv holda inert.</w:t>
       </w:r>
     </w:p>
     <w:tbl>
@@ -577,7 +1976,7 @@
                 <w:b/>
                 <w:sz w:val="22"/>
               </w:rPr>
-              <w:t>Asosiy qonuniyat</w:t>
+              <w:t>Qonuniyat</w:t>
             </w:r>
           </w:p>
         </w:tc>
@@ -616,13 +2015,36 @@
             <w:tcW w:type="dxa" w:w="3685"/>
           </w:tcPr>
           <w:p>
+            <w:pPr>
+              <w:jc w:val="center"/>
+            </w:pPr>
             <w:r/>
-            <w:r>
-              <w:rPr>
-                <w:sz w:val="22"/>
-              </w:rPr>
-              <w:t>S = 6/(ρd)</w:t>
-            </w:r>
+            <m:oMath>
+              <m:r>
+                <m:t xml:space="preserve">S</m:t>
+              </m:r>
+              <m:r>
+                <m:rPr>
+                  <m:sty m:val="p"/>
+                </m:rPr>
+                <m:t xml:space="preserve"> ∝ </m:t>
+              </m:r>
+              <m:f>
+                <m:num>
+                  <m:r>
+                    <m:rPr>
+                      <m:sty m:val="p"/>
+                    </m:rPr>
+                    <m:t xml:space="preserve">1</m:t>
+                  </m:r>
+                </m:num>
+                <m:den>
+                  <m:r>
+                    <m:t xml:space="preserve">d</m:t>
+                  </m:r>
+                </m:den>
+              </m:f>
+            </m:oMath>
           </w:p>
         </w:tc>
       </w:tr>
@@ -651,7 +2073,7 @@
               <w:rPr>
                 <w:sz w:val="22"/>
               </w:rPr>
-              <w:t>ortadi</w:t>
+              <w:t>eksponensial ortadi</w:t>
             </w:r>
           </w:p>
         </w:tc>
@@ -660,13 +2082,42 @@
             <w:tcW w:type="dxa" w:w="3685"/>
           </w:tcPr>
           <w:p>
+            <w:pPr>
+              <w:jc w:val="center"/>
+            </w:pPr>
             <w:r/>
-            <w:r>
-              <w:rPr>
-                <w:sz w:val="22"/>
-              </w:rPr>
-              <w:t>Ostvald–Freyndlix</w:t>
-            </w:r>
+            <m:oMath>
+              <m:r>
+                <m:rPr>
+                  <m:sty m:val="p"/>
+                </m:rPr>
+                <m:t xml:space="preserve">ln</m:t>
+              </m:r>
+              <m:r>
+                <m:t xml:space="preserve">c</m:t>
+              </m:r>
+              <m:r>
+                <m:rPr>
+                  <m:sty m:val="p"/>
+                </m:rPr>
+                <m:t xml:space="preserve"> ∝ </m:t>
+              </m:r>
+              <m:f>
+                <m:num>
+                  <m:r>
+                    <m:rPr>
+                      <m:sty m:val="p"/>
+                    </m:rPr>
+                    <m:t xml:space="preserve">1</m:t>
+                  </m:r>
+                </m:num>
+                <m:den>
+                  <m:r>
+                    <m:t xml:space="preserve">r</m:t>
+                  </m:r>
+                </m:den>
+              </m:f>
+            </m:oMath>
           </w:p>
         </w:tc>
       </w:tr>
@@ -704,13 +2155,48 @@
             <w:tcW w:type="dxa" w:w="3685"/>
           </w:tcPr>
           <w:p>
+            <w:pPr>
+              <w:jc w:val="center"/>
+            </w:pPr>
             <w:r/>
-            <w:r>
-              <w:rPr>
-                <w:sz w:val="22"/>
-              </w:rPr>
-              <w:t>Gibbs–Tomson, ΔT ∝ 1/r</w:t>
-            </w:r>
+            <m:oMath>
+              <m:r>
+                <m:t xml:space="preserve">Δ</m:t>
+              </m:r>
+              <m:sSub>
+                <m:e>
+                  <m:r>
+                    <m:t xml:space="preserve">T</m:t>
+                  </m:r>
+                </m:e>
+                <m:sub>
+                  <m:r>
+                    <m:t xml:space="preserve">m</m:t>
+                  </m:r>
+                </m:sub>
+              </m:sSub>
+              <m:r>
+                <m:rPr>
+                  <m:sty m:val="p"/>
+                </m:rPr>
+                <m:t xml:space="preserve"> ∝ </m:t>
+              </m:r>
+              <m:f>
+                <m:num>
+                  <m:r>
+                    <m:rPr>
+                      <m:sty m:val="p"/>
+                    </m:rPr>
+                    <m:t xml:space="preserve">1</m:t>
+                  </m:r>
+                </m:num>
+                <m:den>
+                  <m:r>
+                    <m:t xml:space="preserve">r</m:t>
+                  </m:r>
+                </m:den>
+              </m:f>
+            </m:oMath>
           </w:p>
         </w:tc>
       </w:tr>
@@ -739,7 +2225,7 @@
               <w:rPr>
                 <w:sz w:val="22"/>
               </w:rPr>
-              <w:t>kamayadi (∝ r²)</w:t>
+              <w:t>kamayadi</w:t>
             </w:r>
           </w:p>
         </w:tc>
@@ -748,13 +2234,36 @@
             <w:tcW w:type="dxa" w:w="3685"/>
           </w:tcPr>
           <w:p>
+            <w:pPr>
+              <w:jc w:val="center"/>
+            </w:pPr>
             <w:r/>
-            <w:r>
-              <w:rPr>
-                <w:sz w:val="22"/>
-              </w:rPr>
-              <w:t>Stoks</w:t>
-            </w:r>
+            <m:oMath>
+              <m:r>
+                <m:t xml:space="preserve">v</m:t>
+              </m:r>
+              <m:r>
+                <m:rPr>
+                  <m:sty m:val="p"/>
+                </m:rPr>
+                <m:t xml:space="preserve"> ∝ </m:t>
+              </m:r>
+              <m:sSup>
+                <m:e>
+                  <m:r>
+                    <m:t xml:space="preserve">r</m:t>
+                  </m:r>
+                </m:e>
+                <m:sup>
+                  <m:r>
+                    <m:rPr>
+                      <m:sty m:val="p"/>
+                    </m:rPr>
+                    <m:t xml:space="preserve">2</m:t>
+                  </m:r>
+                </m:sup>
+              </m:sSup>
+            </m:oMath>
           </w:p>
         </w:tc>
       </w:tr>
@@ -783,7 +2292,7 @@
               <w:rPr>
                 <w:sz w:val="22"/>
               </w:rPr>
-              <w:t>ortadi (∝ 1/r)</w:t>
+              <w:t>ortadi</w:t>
             </w:r>
           </w:p>
         </w:tc>
@@ -792,13 +2301,36 @@
             <w:tcW w:type="dxa" w:w="3685"/>
           </w:tcPr>
           <w:p>
+            <w:pPr>
+              <w:jc w:val="center"/>
+            </w:pPr>
             <w:r/>
-            <w:r>
-              <w:rPr>
-                <w:sz w:val="22"/>
-              </w:rPr>
-              <w:t>Stoks–Eynshteyn</w:t>
-            </w:r>
+            <m:oMath>
+              <m:r>
+                <m:t xml:space="preserve">D</m:t>
+              </m:r>
+              <m:r>
+                <m:rPr>
+                  <m:sty m:val="p"/>
+                </m:rPr>
+                <m:t xml:space="preserve"> ∝ </m:t>
+              </m:r>
+              <m:f>
+                <m:num>
+                  <m:r>
+                    <m:rPr>
+                      <m:sty m:val="p"/>
+                    </m:rPr>
+                    <m:t xml:space="preserve">1</m:t>
+                  </m:r>
+                </m:num>
+                <m:den>
+                  <m:r>
+                    <m:t xml:space="preserve">r</m:t>
+                  </m:r>
+                </m:den>
+              </m:f>
+            </m:oMath>
           </w:p>
         </w:tc>
       </w:tr>
@@ -836,13 +2368,60 @@
             <w:tcW w:type="dxa" w:w="3685"/>
           </w:tcPr>
           <w:p>
+            <w:pPr>
+              <w:jc w:val="center"/>
+            </w:pPr>
             <w:r/>
-            <w:r>
-              <w:rPr>
-                <w:sz w:val="22"/>
-              </w:rPr>
-              <w:t>E_g ∝ 1/r²</w:t>
-            </w:r>
+            <m:oMath>
+              <m:r>
+                <m:t xml:space="preserve">Δ</m:t>
+              </m:r>
+              <m:sSub>
+                <m:e>
+                  <m:r>
+                    <m:t xml:space="preserve">E</m:t>
+                  </m:r>
+                </m:e>
+                <m:sub>
+                  <m:r>
+                    <m:t xml:space="preserve">g</m:t>
+                  </m:r>
+                </m:sub>
+              </m:sSub>
+              <m:r>
+                <m:rPr>
+                  <m:sty m:val="p"/>
+                </m:rPr>
+                <m:t xml:space="preserve"> ∝ </m:t>
+              </m:r>
+              <m:f>
+                <m:num>
+                  <m:r>
+                    <m:rPr>
+                      <m:sty m:val="p"/>
+                    </m:rPr>
+                    <m:t xml:space="preserve">1</m:t>
+                  </m:r>
+                </m:num>
+                <m:den>
+                  <m:sSup>
+                    <m:e>
+                      <m:r>
+                        <m:t xml:space="preserve">r</m:t>
+                      </m:r>
+                    </m:e>
+                    <m:sup>
+                      <m:r>
+                        <m:rPr>
+                          <m:sty m:val="p"/>
+                        </m:rPr>
+                        <m:t xml:space="preserve">2</m:t>
+                      </m:r>
+                    </m:sup>
+                  </m:sSup>
+                </m:den>
+              </m:f>
+            </m:oMath>
           </w:p>
         </w:tc>
       </w:tr>
@@ -913,7 +2492,224 @@
           <w:b w:val="0"/>
           <w:i w:val="0"/>
         </w:rPr>
-        <w:t>Bir xil hajmdagi zarrachalarda shakl o'zgarishi sirt/hajm nisbatini, ochiq kristall yuzalar turini va zaryad taqsimotini o'zgartiradi. Asosiy geometrik parametr — aspekt nisbati (AR = uzunlik/diametr).</w:t>
+        <w:t xml:space="preserve">Bir xil hajmdagi zarrachalarda shakl o'zgarishi sirt/hajm nisbatini, ochiq kristall yuzalar turini va zaryad taqsimotini o'zgartiradi. Asosiy geometrik parametr — aspekt nisbati </w:t>
+      </w:r>
+      <m:oMath>
+        <m:r>
+          <m:rPr>
+            <m:sty m:val="p"/>
+          </m:rPr>
+          <m:t xml:space="preserve">AR</m:t>
+        </m:r>
+        <m:r>
+          <m:rPr>
+            <m:sty m:val="p"/>
+          </m:rPr>
+          <m:t xml:space="preserve"> = </m:t>
+        </m:r>
+        <m:f>
+          <m:num>
+            <m:r>
+              <m:t xml:space="preserve">L</m:t>
+            </m:r>
+          </m:num>
+          <m:den>
+            <m:r>
+              <m:t xml:space="preserve">d</m:t>
+            </m:r>
+          </m:den>
+        </m:f>
+      </m:oMath>
+      <w:r>
+        <w:rPr>
+          <w:b w:val="0"/>
+          <w:i w:val="0"/>
+        </w:rPr>
+        <w:t xml:space="preserve"> (uzunlikning diametrga nisbati).</w:t>
+      </w:r>
+    </w:p>
+    <w:p>
+      <w:pPr>
+        <w:jc w:val="both"/>
+      </w:pPr>
+      <w:r>
+        <w:rPr>
+          <w:b/>
+          <w:i w:val="0"/>
+        </w:rPr>
+        <w:t xml:space="preserve">Reologiya. </w:t>
+      </w:r>
+      <w:r>
+        <w:rPr>
+          <w:b w:val="0"/>
+          <w:i w:val="0"/>
+        </w:rPr>
+        <w:t>Suyultirilgan sferik zollar uchun Eynshteyn tenglamasi o'rinli:</w:t>
+      </w:r>
+    </w:p>
+    <w:tbl>
+      <w:tblPr>
+        <w:tblW w:type="auto" w:w="0"/>
+        <w:jc w:val="center"/>
+        <w:tblLook w:firstColumn="1" w:firstRow="1" w:lastColumn="0" w:lastRow="0" w:noHBand="0" w:noVBand="1" w:val="04A0"/>
+      </w:tblPr>
+      <w:tblGrid>
+        <w:gridCol w:w="4986"/>
+        <w:gridCol w:w="4986"/>
+      </w:tblGrid>
+      <w:tr>
+        <w:tc>
+          <w:tcPr>
+            <w:tcW w:type="dxa" w:w="8220"/>
+          </w:tcPr>
+          <w:p>
+            <w:pPr>
+              <w:spacing w:after="40" w:before="40"/>
+              <w:jc w:val="center"/>
+            </w:pPr>
+            <m:oMath>
+              <m:r>
+                <m:t xml:space="preserve">η</m:t>
+              </m:r>
+              <m:r>
+                <m:rPr>
+                  <m:sty m:val="p"/>
+                </m:rPr>
+                <m:t xml:space="preserve"> = </m:t>
+              </m:r>
+              <m:sSub>
+                <m:e>
+                  <m:r>
+                    <m:t xml:space="preserve">η</m:t>
+                  </m:r>
+                </m:e>
+                <m:sub>
+                  <m:r>
+                    <m:rPr>
+                      <m:sty m:val="p"/>
+                    </m:rPr>
+                    <m:t xml:space="preserve">0</m:t>
+                  </m:r>
+                </m:sub>
+              </m:sSub>
+              <m:d>
+                <m:dPr>
+                  <m:begChr m:val="("/>
+                  <m:endChr m:val=")"/>
+                </m:dPr>
+                <m:e>
+                  <m:r>
+                    <m:rPr>
+                      <m:sty m:val="p"/>
+                    </m:rPr>
+                    <m:t xml:space="preserve">1 + </m:t>
+                  </m:r>
+                  <m:r>
+                    <m:t xml:space="preserve">k</m:t>
+                  </m:r>
+                  <m:r>
+                    <m:t xml:space="preserve">φ</m:t>
+                  </m:r>
+                </m:e>
+              </m:d>
+            </m:oMath>
+          </w:p>
+        </w:tc>
+        <w:tc>
+          <w:tcPr>
+            <w:tcW w:type="dxa" w:w="1134"/>
+          </w:tcPr>
+          <w:p>
+            <w:pPr>
+              <w:spacing w:after="40" w:before="40"/>
+              <w:jc w:val="right"/>
+            </w:pPr>
+            <w:r>
+              <w:t>(8)</w:t>
+            </w:r>
+          </w:p>
+        </w:tc>
+      </w:tr>
+    </w:tbl>
+    <w:p>
+      <w:pPr>
+        <w:spacing w:after="120"/>
+        <w:jc w:val="both"/>
+      </w:pPr>
+      <w:r>
+        <w:t xml:space="preserve">bu yerda </w:t>
+      </w:r>
+      <m:oMath>
+        <m:sSub>
+          <m:e>
+            <m:r>
+              <m:t xml:space="preserve">η</m:t>
+            </m:r>
+          </m:e>
+          <m:sub>
+            <m:r>
+              <m:rPr>
+                <m:sty m:val="p"/>
+              </m:rPr>
+              <m:t xml:space="preserve">0</m:t>
+            </m:r>
+          </m:sub>
+        </m:sSub>
+      </m:oMath>
+      <w:r>
+        <w:rPr>
+          <w:b w:val="0"/>
+          <w:i w:val="0"/>
+        </w:rPr>
+        <w:t xml:space="preserve"> — muhit qovushqoqligi, </w:t>
+      </w:r>
+      <m:oMath>
+        <m:r>
+          <m:t xml:space="preserve">φ</m:t>
+        </m:r>
+      </m:oMath>
+      <w:r>
+        <w:rPr>
+          <w:b w:val="0"/>
+          <w:i w:val="0"/>
+        </w:rPr>
+        <w:t xml:space="preserve"> — dispers faza hajmiy ulushi, </w:t>
+      </w:r>
+      <m:oMath>
+        <m:r>
+          <m:t xml:space="preserve">k</m:t>
+        </m:r>
+        <m:r>
+          <m:rPr>
+            <m:sty m:val="p"/>
+          </m:rPr>
+          <m:t xml:space="preserve"> = 2,5</m:t>
+        </m:r>
+      </m:oMath>
+      <w:r>
+        <w:rPr>
+          <w:b w:val="0"/>
+          <w:i w:val="0"/>
+        </w:rPr>
+        <w:t xml:space="preserve"> — sferik zarrachalar uchun; nosferik (tayoqcha, plastinka) zarrachalarda </w:t>
+      </w:r>
+      <m:oMath>
+        <m:r>
+          <m:t xml:space="preserve">k</m:t>
+        </m:r>
+        <m:r>
+          <m:rPr>
+            <m:sty m:val="p"/>
+          </m:rPr>
+          <m:t xml:space="preserve"> &gt; 2,5</m:t>
+        </m:r>
+      </m:oMath>
+      <w:r>
+        <w:rPr>
+          <w:b w:val="0"/>
+          <w:i w:val="0"/>
+        </w:rPr>
+        <w:t xml:space="preserve"> va u aspekt nisbati bilan ortadi, tizim tiksotrop/psevdoplastik xususiyat oladi (nanoglina, nanoselluloza).</w:t>
       </w:r>
     </w:p>
     <w:p>
@@ -958,26 +2754,10 @@
         <w:rPr>
           <w:b/>
         </w:rPr>
-        <w:t xml:space="preserve">Reologiya: </w:t>
-      </w:r>
-      <w:r>
-        <w:t>suyultirilgan sferik zollar uchun Eynshteyn tenglamasi η = η₀(1 + 2,5φ); nosferik zarrachalarda koeffitsient 2,5 dan katta va tizim tiksotrop/psevdoplastik xususiyat oladi (nanoglina, nanoselluloza).</w:t>
-      </w:r>
-    </w:p>
-    <w:p>
-      <w:pPr>
-        <w:pStyle w:val="ListBullet"/>
-        <w:spacing w:after="40"/>
-        <w:jc w:val="both"/>
-      </w:pPr>
-      <w:r>
-        <w:rPr>
-          <w:b/>
-        </w:rPr>
         <w:t xml:space="preserve">Barqarorlik va o'zaro ta'sir: </w:t>
       </w:r>
       <w:r>
-        <w:t>plastinkasimon va tayoqchasimon zarrachalar uchun van-der-Vaals tortishish geometriyaga bog'liq; qirra va uchlarda maydon kontsentratsiyasi ortadi ("lightning rod" effekti).</w:t>
+        <w:t>plastinkasimon va tayoqchasimon zarrachalar uchun van-der-Vaals tortishish geometriyaga bog'liq; qirra va uchlarda elektr maydon kontsentratsiyasi ortadi ("lightning rod" effekti).</w:t>
       </w:r>
     </w:p>
     <w:p>
@@ -1006,6 +2786,7 @@
     </w:p>
     <w:p>
       <w:pPr>
+        <w:spacing w:after="40"/>
         <w:jc w:val="both"/>
       </w:pPr>
       <w:r>
@@ -1013,21 +2794,496 @@
           <w:b w:val="0"/>
           <w:i w:val="0"/>
         </w:rPr>
-        <w:t xml:space="preserve">DLVO nazariyasiga ko'ra zarrachalar orasidagi natijaviy energiya </w:t>
+        <w:t>DLVO nazariyasiga ko'ra ikki zarracha orasidagi natijaviy o'zaro ta'sir energiyasi elektrostatik itarilish va van-der-Vaals tortishish yig'indisidan iborat:</w:t>
       </w:r>
+    </w:p>
+    <w:tbl>
+      <w:tblPr>
+        <w:tblW w:type="auto" w:w="0"/>
+        <w:jc w:val="center"/>
+        <w:tblLook w:firstColumn="1" w:firstRow="1" w:lastColumn="0" w:lastRow="0" w:noHBand="0" w:noVBand="1" w:val="04A0"/>
+      </w:tblPr>
+      <w:tblGrid>
+        <w:gridCol w:w="4986"/>
+        <w:gridCol w:w="4986"/>
+      </w:tblGrid>
+      <w:tr>
+        <w:tc>
+          <w:tcPr>
+            <w:tcW w:type="dxa" w:w="8220"/>
+          </w:tcPr>
+          <w:p>
+            <w:pPr>
+              <w:spacing w:after="40" w:before="40"/>
+              <w:jc w:val="center"/>
+            </w:pPr>
+            <m:oMath>
+              <m:r>
+                <m:t xml:space="preserve">U</m:t>
+              </m:r>
+              <m:d>
+                <m:dPr>
+                  <m:begChr m:val="("/>
+                  <m:endChr m:val=")"/>
+                </m:dPr>
+                <m:e>
+                  <m:r>
+                    <m:t xml:space="preserve">h</m:t>
+                  </m:r>
+                </m:e>
+              </m:d>
+              <m:r>
+                <m:rPr>
+                  <m:sty m:val="p"/>
+                </m:rPr>
+                <m:t xml:space="preserve"> = </m:t>
+              </m:r>
+              <m:sSub>
+                <m:e>
+                  <m:r>
+                    <m:t xml:space="preserve">U</m:t>
+                  </m:r>
+                </m:e>
+                <m:sub>
+                  <m:r>
+                    <m:rPr>
+                      <m:sty m:val="p"/>
+                    </m:rPr>
+                    <m:t xml:space="preserve">el</m:t>
+                  </m:r>
+                </m:sub>
+              </m:sSub>
+              <m:d>
+                <m:dPr>
+                  <m:begChr m:val="("/>
+                  <m:endChr m:val=")"/>
+                </m:dPr>
+                <m:e>
+                  <m:r>
+                    <m:t xml:space="preserve">h</m:t>
+                  </m:r>
+                </m:e>
+              </m:d>
+              <m:r>
+                <m:rPr>
+                  <m:sty m:val="p"/>
+                </m:rPr>
+                <m:t xml:space="preserve"> + </m:t>
+              </m:r>
+              <m:sSub>
+                <m:e>
+                  <m:r>
+                    <m:t xml:space="preserve">U</m:t>
+                  </m:r>
+                </m:e>
+                <m:sub>
+                  <m:r>
+                    <m:rPr>
+                      <m:sty m:val="p"/>
+                    </m:rPr>
+                    <m:t xml:space="preserve">vdW</m:t>
+                  </m:r>
+                </m:sub>
+              </m:sSub>
+              <m:d>
+                <m:dPr>
+                  <m:begChr m:val="("/>
+                  <m:endChr m:val=")"/>
+                </m:dPr>
+                <m:e>
+                  <m:r>
+                    <m:t xml:space="preserve">h</m:t>
+                  </m:r>
+                </m:e>
+              </m:d>
+              <m:r>
+                <m:rPr>
+                  <m:sty m:val="p"/>
+                </m:rPr>
+                <m:t xml:space="preserve"> = </m:t>
+              </m:r>
+              <m:r>
+                <m:rPr>
+                  <m:sty m:val="p"/>
+                </m:rPr>
+                <m:t xml:space="preserve">2</m:t>
+              </m:r>
+              <m:r>
+                <m:t xml:space="preserve">π</m:t>
+              </m:r>
+              <m:r>
+                <m:t xml:space="preserve">ε</m:t>
+              </m:r>
+              <m:sSub>
+                <m:e>
+                  <m:r>
+                    <m:t xml:space="preserve">ε</m:t>
+                  </m:r>
+                </m:e>
+                <m:sub>
+                  <m:r>
+                    <m:rPr>
+                      <m:sty m:val="p"/>
+                    </m:rPr>
+                    <m:t xml:space="preserve">0</m:t>
+                  </m:r>
+                </m:sub>
+              </m:sSub>
+              <m:r>
+                <m:t xml:space="preserve">r</m:t>
+              </m:r>
+              <m:sSubSup>
+                <m:e>
+                  <m:r>
+                    <m:t xml:space="preserve">ψ</m:t>
+                  </m:r>
+                </m:e>
+                <m:sub>
+                  <m:r>
+                    <m:rPr>
+                      <m:sty m:val="p"/>
+                    </m:rPr>
+                    <m:t xml:space="preserve">0</m:t>
+                  </m:r>
+                </m:sub>
+                <m:sup>
+                  <m:r>
+                    <m:rPr>
+                      <m:sty m:val="p"/>
+                    </m:rPr>
+                    <m:t xml:space="preserve">2</m:t>
+                  </m:r>
+                </m:sup>
+              </m:sSubSup>
+              <m:sSup>
+                <m:e>
+                  <m:r>
+                    <m:t xml:space="preserve">e</m:t>
+                  </m:r>
+                </m:e>
+                <m:sup>
+                  <m:r>
+                    <m:rPr>
+                      <m:sty m:val="p"/>
+                    </m:rPr>
+                    <m:t xml:space="preserve">−</m:t>
+                  </m:r>
+                  <m:r>
+                    <m:t xml:space="preserve">κ</m:t>
+                  </m:r>
+                  <m:r>
+                    <m:t xml:space="preserve">h</m:t>
+                  </m:r>
+                </m:sup>
+              </m:sSup>
+              <m:r>
+                <m:rPr>
+                  <m:sty m:val="p"/>
+                </m:rPr>
+                <m:t xml:space="preserve"> − </m:t>
+              </m:r>
+              <m:f>
+                <m:num>
+                  <m:r>
+                    <m:t xml:space="preserve">A</m:t>
+                  </m:r>
+                  <m:r>
+                    <m:t xml:space="preserve">r</m:t>
+                  </m:r>
+                </m:num>
+                <m:den>
+                  <m:r>
+                    <m:rPr>
+                      <m:sty m:val="p"/>
+                    </m:rPr>
+                    <m:t xml:space="preserve">12</m:t>
+                  </m:r>
+                  <m:r>
+                    <m:t xml:space="preserve">h</m:t>
+                  </m:r>
+                </m:den>
+              </m:f>
+            </m:oMath>
+          </w:p>
+        </w:tc>
+        <w:tc>
+          <w:tcPr>
+            <w:tcW w:type="dxa" w:w="1134"/>
+          </w:tcPr>
+          <w:p>
+            <w:pPr>
+              <w:spacing w:after="40" w:before="40"/>
+              <w:jc w:val="right"/>
+            </w:pPr>
+            <w:r>
+              <w:t>(9)</w:t>
+            </w:r>
+          </w:p>
+        </w:tc>
+      </w:tr>
+    </w:tbl>
+    <w:p>
+      <w:pPr>
+        <w:spacing w:after="120"/>
+        <w:jc w:val="both"/>
+      </w:pPr>
       <w:r>
-        <w:rPr>
-          <w:b/>
-          <w:i w:val="0"/>
-        </w:rPr>
-        <w:t>U = U_el + U_vdW</w:t>
+        <w:t xml:space="preserve">bu yerda </w:t>
       </w:r>
+      <m:oMath>
+        <m:r>
+          <m:t xml:space="preserve">h</m:t>
+        </m:r>
+      </m:oMath>
       <w:r>
         <w:rPr>
           <w:b w:val="0"/>
           <w:i w:val="0"/>
         </w:rPr>
-        <w:t xml:space="preserve"> — elektrostatik itarilish va van-der-Vaals tortishish yig'indisidir. Sirt modifikatsiyasining vazifasi energetik to'siq balandligini (&gt; 15–25 kT) ta'minlab, zarrachalarni birlamchi minimumga tushishdan saqlashdir.</w:t>
+        <w:t xml:space="preserve"> — sirtlar orasidagi masofa, </w:t>
+      </w:r>
+      <m:oMath>
+        <m:sSub>
+          <m:e>
+            <m:r>
+              <m:t xml:space="preserve">ψ</m:t>
+            </m:r>
+          </m:e>
+          <m:sub>
+            <m:r>
+              <m:rPr>
+                <m:sty m:val="p"/>
+              </m:rPr>
+              <m:t xml:space="preserve">0</m:t>
+            </m:r>
+          </m:sub>
+        </m:sSub>
+      </m:oMath>
+      <w:r>
+        <w:rPr>
+          <w:b w:val="0"/>
+          <w:i w:val="0"/>
+        </w:rPr>
+        <w:t xml:space="preserve"> — sirt potensiali, </w:t>
+      </w:r>
+      <m:oMath>
+        <m:r>
+          <m:t xml:space="preserve">A</m:t>
+        </m:r>
+      </m:oMath>
+      <w:r>
+        <w:rPr>
+          <w:b w:val="0"/>
+          <w:i w:val="0"/>
+        </w:rPr>
+        <w:t xml:space="preserve"> — Gamaker doimiysi, </w:t>
+      </w:r>
+      <m:oMath>
+        <m:r>
+          <m:t xml:space="preserve">κ</m:t>
+        </m:r>
+      </m:oMath>
+      <w:r>
+        <w:rPr>
+          <w:b w:val="0"/>
+          <w:i w:val="0"/>
+        </w:rPr>
+        <w:t xml:space="preserve"> — Debay parametri.</w:t>
+      </w:r>
+    </w:p>
+    <w:p>
+      <w:pPr>
+        <w:jc w:val="both"/>
+      </w:pPr>
+      <w:r>
+        <w:rPr>
+          <w:b w:val="0"/>
+          <w:i w:val="0"/>
+        </w:rPr>
+        <w:t>Qo'sh elektr qavat qalinligi (Debay uzunligi) elektrolit konsentratsiyasiga bog'liq:</w:t>
+      </w:r>
+    </w:p>
+    <w:tbl>
+      <w:tblPr>
+        <w:tblW w:type="auto" w:w="0"/>
+        <w:jc w:val="center"/>
+        <w:tblLook w:firstColumn="1" w:firstRow="1" w:lastColumn="0" w:lastRow="0" w:noHBand="0" w:noVBand="1" w:val="04A0"/>
+      </w:tblPr>
+      <w:tblGrid>
+        <w:gridCol w:w="4986"/>
+        <w:gridCol w:w="4986"/>
+      </w:tblGrid>
+      <w:tr>
+        <w:tc>
+          <w:tcPr>
+            <w:tcW w:type="dxa" w:w="8220"/>
+          </w:tcPr>
+          <w:p>
+            <w:pPr>
+              <w:spacing w:after="40" w:before="40"/>
+              <w:jc w:val="center"/>
+            </w:pPr>
+            <m:oMath>
+              <m:sSup>
+                <m:e>
+                  <m:r>
+                    <m:t xml:space="preserve">κ</m:t>
+                  </m:r>
+                </m:e>
+                <m:sup>
+                  <m:r>
+                    <m:rPr>
+                      <m:sty m:val="p"/>
+                    </m:rPr>
+                    <m:t xml:space="preserve">−1</m:t>
+                  </m:r>
+                </m:sup>
+              </m:sSup>
+              <m:r>
+                <m:rPr>
+                  <m:sty m:val="p"/>
+                </m:rPr>
+                <m:t xml:space="preserve"> = </m:t>
+              </m:r>
+              <m:rad>
+                <m:radPr>
+                  <m:degHide m:val="1"/>
+                </m:radPr>
+                <m:deg/>
+                <m:e>
+                  <m:f>
+                    <m:num>
+                      <m:r>
+                        <m:t xml:space="preserve">ε</m:t>
+                      </m:r>
+                      <m:sSub>
+                        <m:e>
+                          <m:r>
+                            <m:t xml:space="preserve">ε</m:t>
+                          </m:r>
+                        </m:e>
+                        <m:sub>
+                          <m:r>
+                            <m:rPr>
+                              <m:sty m:val="p"/>
+                            </m:rPr>
+                            <m:t xml:space="preserve">0</m:t>
+                          </m:r>
+                        </m:sub>
+                      </m:sSub>
+                      <m:sSub>
+                        <m:e>
+                          <m:r>
+                            <m:t xml:space="preserve">k</m:t>
+                          </m:r>
+                        </m:e>
+                        <m:sub>
+                          <m:r>
+                            <m:rPr>
+                              <m:sty m:val="p"/>
+                            </m:rPr>
+                            <m:t xml:space="preserve">B</m:t>
+                          </m:r>
+                        </m:sub>
+                      </m:sSub>
+                      <m:r>
+                        <m:t xml:space="preserve">T</m:t>
+                      </m:r>
+                    </m:num>
+                    <m:den>
+                      <m:r>
+                        <m:rPr>
+                          <m:sty m:val="p"/>
+                        </m:rPr>
+                        <m:t xml:space="preserve">2</m:t>
+                      </m:r>
+                      <m:sSub>
+                        <m:e>
+                          <m:r>
+                            <m:t xml:space="preserve">N</m:t>
+                          </m:r>
+                        </m:e>
+                        <m:sub>
+                          <m:r>
+                            <m:rPr>
+                              <m:sty m:val="p"/>
+                            </m:rPr>
+                            <m:t xml:space="preserve">A</m:t>
+                          </m:r>
+                        </m:sub>
+                      </m:sSub>
+                      <m:sSup>
+                        <m:e>
+                          <m:r>
+                            <m:t xml:space="preserve">e</m:t>
+                          </m:r>
+                        </m:e>
+                        <m:sup>
+                          <m:r>
+                            <m:rPr>
+                              <m:sty m:val="p"/>
+                            </m:rPr>
+                            <m:t xml:space="preserve">2</m:t>
+                          </m:r>
+                        </m:sup>
+                      </m:sSup>
+                      <m:r>
+                        <m:t xml:space="preserve">I</m:t>
+                      </m:r>
+                    </m:den>
+                  </m:f>
+                </m:e>
+              </m:rad>
+            </m:oMath>
+          </w:p>
+        </w:tc>
+        <w:tc>
+          <w:tcPr>
+            <w:tcW w:type="dxa" w:w="1134"/>
+          </w:tcPr>
+          <w:p>
+            <w:pPr>
+              <w:spacing w:after="40" w:before="40"/>
+              <w:jc w:val="right"/>
+            </w:pPr>
+            <w:r>
+              <w:t>(10)</w:t>
+            </w:r>
+          </w:p>
+        </w:tc>
+      </w:tr>
+    </w:tbl>
+    <w:p>
+      <w:pPr>
+        <w:spacing w:after="120"/>
+        <w:jc w:val="both"/>
+      </w:pPr>
+      <w:r>
+        <w:t xml:space="preserve">bu yerda </w:t>
+      </w:r>
+      <m:oMath>
+        <m:r>
+          <m:t xml:space="preserve">I</m:t>
+        </m:r>
+      </m:oMath>
+      <w:r>
+        <w:rPr>
+          <w:b w:val="0"/>
+          <w:i w:val="0"/>
+        </w:rPr>
+        <w:t xml:space="preserve"> — eritmaning ion kuchi. Suvda 25 °C da: 1 mM NaCl → ≈ 10 nm, 100 mM → ≈ 1 nm.</w:t>
+      </w:r>
+    </w:p>
+    <w:p>
+      <w:pPr>
+        <w:jc w:val="both"/>
+      </w:pPr>
+      <w:r>
+        <w:rPr>
+          <w:b w:val="0"/>
+          <w:i w:val="0"/>
+        </w:rPr>
+        <w:t>Sirt modifikatsiyasining vazifasi energetik to'siq balandligini (&gt; 15–25 kT) ta'minlab, zarrachalarni birlamchi minimumga tushishdan (qaytmas koagulyatsiyadan) saqlashdir.</w:t>
       </w:r>
     </w:p>
     <w:p>
@@ -1043,7 +3299,7 @@
         <w:t xml:space="preserve">Elektrostatik stabilizatsiya: </w:t>
       </w:r>
       <w:r>
-        <w:t>ionogen ligandlar (sitrat, SDS, CTAB) qo'sh elektr qavat hosil qiladi; |ζ| &gt; 30 mV — barqaror, |ζ| &lt; 10 mV — koagulyatsiyaga moyil. Elektrolit qo'shilishi Debay uzunligini (κ⁻¹) qisqartirib, Shulse–Gardi qoidasi bo'yicha koagulyatsiya chaqiradi.</w:t>
+        <w:t>ionogen ligandlar (sitrat, SDS, CTAB) qo'sh elektr qavat hosil qiladi; |ζ| &gt; 30 mV — barqaror, |ζ| &lt; 10 mV — koagulyatsiyaga moyil. Elektrolit qo'shilishi Debay uzunligini qisqartirib, Shulse–Gardi qoidasi bo'yicha (koagulyatsiya ostonasi ∝ 1/z⁶) koagulyatsiya chaqiradi.</w:t>
       </w:r>
     </w:p>
     <w:p>
@@ -1380,7 +3636,7 @@
               <w:rPr>
                 <w:sz w:val="22"/>
               </w:rPr>
-              <w:t>Optik/ lyuminessensiya</w:t>
+              <w:t>Optik / lyuminessensiya</w:t>
             </w:r>
           </w:p>
         </w:tc>
@@ -1469,6 +3725,232 @@
       </w:pPr>
       <w:r>
         <w:t>4.5. Tadqiqot va nazorat usullari</w:t>
+      </w:r>
+    </w:p>
+    <w:p>
+      <w:pPr>
+        <w:jc w:val="both"/>
+      </w:pPr>
+      <w:r>
+        <w:rPr>
+          <w:b w:val="0"/>
+          <w:i w:val="0"/>
+        </w:rPr>
+        <w:t>Kristallit o'lchami rentgen difraktogrammasidagi cho'qqi kengayishidan Sherrer tenglamasi orqali topiladi:</w:t>
+      </w:r>
+    </w:p>
+    <w:tbl>
+      <w:tblPr>
+        <w:tblW w:type="auto" w:w="0"/>
+        <w:jc w:val="center"/>
+        <w:tblLook w:firstColumn="1" w:firstRow="1" w:lastColumn="0" w:lastRow="0" w:noHBand="0" w:noVBand="1" w:val="04A0"/>
+      </w:tblPr>
+      <w:tblGrid>
+        <w:gridCol w:w="4986"/>
+        <w:gridCol w:w="4986"/>
+      </w:tblGrid>
+      <w:tr>
+        <w:tc>
+          <w:tcPr>
+            <w:tcW w:type="dxa" w:w="8220"/>
+          </w:tcPr>
+          <w:p>
+            <w:pPr>
+              <w:spacing w:after="40" w:before="40"/>
+              <w:jc w:val="center"/>
+            </w:pPr>
+            <m:oMath>
+              <m:r>
+                <m:t xml:space="preserve">D</m:t>
+              </m:r>
+              <m:r>
+                <m:rPr>
+                  <m:sty m:val="p"/>
+                </m:rPr>
+                <m:t xml:space="preserve"> = </m:t>
+              </m:r>
+              <m:f>
+                <m:num>
+                  <m:r>
+                    <m:t xml:space="preserve">K</m:t>
+                  </m:r>
+                  <m:r>
+                    <m:t xml:space="preserve">λ</m:t>
+                  </m:r>
+                </m:num>
+                <m:den>
+                  <m:r>
+                    <m:t xml:space="preserve">β</m:t>
+                  </m:r>
+                  <m:r>
+                    <m:rPr>
+                      <m:sty m:val="p"/>
+                    </m:rPr>
+                    <m:t xml:space="preserve">cos</m:t>
+                  </m:r>
+                  <m:r>
+                    <m:t xml:space="preserve">θ</m:t>
+                  </m:r>
+                </m:den>
+              </m:f>
+            </m:oMath>
+          </w:p>
+        </w:tc>
+        <w:tc>
+          <w:tcPr>
+            <w:tcW w:type="dxa" w:w="1134"/>
+          </w:tcPr>
+          <w:p>
+            <w:pPr>
+              <w:spacing w:after="40" w:before="40"/>
+              <w:jc w:val="right"/>
+            </w:pPr>
+            <w:r>
+              <w:t>(11)</w:t>
+            </w:r>
+          </w:p>
+        </w:tc>
+      </w:tr>
+    </w:tbl>
+    <w:p>
+      <w:pPr>
+        <w:spacing w:after="120"/>
+        <w:jc w:val="both"/>
+      </w:pPr>
+      <w:r>
+        <w:t xml:space="preserve">bu yerda </w:t>
+      </w:r>
+      <m:oMath>
+        <m:r>
+          <m:t xml:space="preserve">K</m:t>
+        </m:r>
+        <m:r>
+          <m:rPr>
+            <m:sty m:val="p"/>
+          </m:rPr>
+          <m:t xml:space="preserve"> ≈ 0,9</m:t>
+        </m:r>
+      </m:oMath>
+      <w:r>
+        <w:rPr>
+          <w:b w:val="0"/>
+          <w:i w:val="0"/>
+        </w:rPr>
+        <w:t xml:space="preserve"> — shakl omili, </w:t>
+      </w:r>
+      <m:oMath>
+        <m:r>
+          <m:t xml:space="preserve">λ</m:t>
+        </m:r>
+      </m:oMath>
+      <w:r>
+        <w:rPr>
+          <w:b w:val="0"/>
+          <w:i w:val="0"/>
+        </w:rPr>
+        <w:t xml:space="preserve"> — rentgen nurlanish to'lqin uzunligi, </w:t>
+      </w:r>
+      <m:oMath>
+        <m:r>
+          <m:t xml:space="preserve">β</m:t>
+        </m:r>
+      </m:oMath>
+      <w:r>
+        <w:rPr>
+          <w:b w:val="0"/>
+          <w:i w:val="0"/>
+        </w:rPr>
+        <w:t xml:space="preserve"> — cho'qqining yarim balandlikdagi kengligi (radianlarda), </w:t>
+      </w:r>
+      <m:oMath>
+        <m:r>
+          <m:t xml:space="preserve">θ</m:t>
+        </m:r>
+      </m:oMath>
+      <w:r>
+        <w:rPr>
+          <w:b w:val="0"/>
+          <w:i w:val="0"/>
+        </w:rPr>
+        <w:t xml:space="preserve"> — Bregg burchagi.</w:t>
+      </w:r>
+    </w:p>
+    <w:p>
+      <w:pPr>
+        <w:jc w:val="both"/>
+      </w:pPr>
+      <w:r>
+        <w:rPr>
+          <w:b w:val="0"/>
+          <w:i w:val="0"/>
+        </w:rPr>
+        <w:t xml:space="preserve">Gidrodinamik diametr DLS usulida Stoks–Eynshteyn tenglamasi (6) orqali o'lchangan diffuziya koeffitsientidan hisoblanadi: </w:t>
+      </w:r>
+      <m:oMath>
+        <m:sSub>
+          <m:e>
+            <m:r>
+              <m:t xml:space="preserve">d</m:t>
+            </m:r>
+          </m:e>
+          <m:sub>
+            <m:r>
+              <m:t xml:space="preserve">H</m:t>
+            </m:r>
+          </m:sub>
+        </m:sSub>
+        <m:r>
+          <m:rPr>
+            <m:sty m:val="p"/>
+          </m:rPr>
+          <m:t xml:space="preserve"> = </m:t>
+        </m:r>
+        <m:f>
+          <m:num>
+            <m:sSub>
+              <m:e>
+                <m:r>
+                  <m:t xml:space="preserve">k</m:t>
+                </m:r>
+              </m:e>
+              <m:sub>
+                <m:r>
+                  <m:rPr>
+                    <m:sty m:val="p"/>
+                  </m:rPr>
+                  <m:t xml:space="preserve">B</m:t>
+                </m:r>
+              </m:sub>
+            </m:sSub>
+            <m:r>
+              <m:t xml:space="preserve">T</m:t>
+            </m:r>
+          </m:num>
+          <m:den>
+            <m:r>
+              <m:rPr>
+                <m:sty m:val="p"/>
+              </m:rPr>
+              <m:t xml:space="preserve">3</m:t>
+            </m:r>
+            <m:r>
+              <m:t xml:space="preserve">π</m:t>
+            </m:r>
+            <m:r>
+              <m:t xml:space="preserve">η</m:t>
+            </m:r>
+            <m:r>
+              <m:t xml:space="preserve">D</m:t>
+            </m:r>
+          </m:den>
+        </m:f>
+      </m:oMath>
+      <w:r>
+        <w:rPr>
+          <w:b w:val="0"/>
+          <w:i w:val="0"/>
+        </w:rPr>
+        <w:t>.</w:t>
       </w:r>
     </w:p>
     <w:tbl>
@@ -1699,7 +4181,7 @@
               <w:rPr>
                 <w:sz w:val="22"/>
               </w:rPr>
-              <w:t>kristallit o'lchami D = Kλ/(β cosθ)</w:t>
+              <w:t>kristallit o'lchami, faza</w:t>
             </w:r>
           </w:p>
         </w:tc>
@@ -1713,7 +4195,7 @@
               <w:rPr>
                 <w:sz w:val="22"/>
               </w:rPr>
-              <w:t>faza tarkibi</w:t>
+              <w:t>tenglama (11)</w:t>
             </w:r>
           </w:p>
         </w:tc>
@@ -1743,7 +4225,7 @@
               <w:rPr>
                 <w:sz w:val="22"/>
               </w:rPr>
-              <w:t>SPR / E_g, agregatsiya</w:t>
+              <w:t>SPR / taqiqlangan zona, agregatsiya</w:t>
             </w:r>
           </w:p>
         </w:tc>
@@ -2027,7 +4509,7 @@
         <w:rPr>
           <w:sz w:val="22"/>
         </w:rPr>
-        <w:t>5. Burda C., Chen X., Narayanan R., El-Sayed M.A. Chemistry and properties of nanocrystals of different shapes // Chem. Rev. – 2005. – Vol. 105. – P. 1025–1102.</w:t>
+        <w:t>5. Brus L.E. Electron–electron and electron-hole interactions in small semiconductor crystallites // J. Chem. Phys. – 1984. – Vol. 80. – P. 4403–4409.</w:t>
       </w:r>
     </w:p>
     <w:p>
@@ -2039,7 +4521,7 @@
         <w:rPr>
           <w:sz w:val="22"/>
         </w:rPr>
-        <w:t>6. Sperling R.A., Parak W.J. Surface modification, functionalization and bioconjugation of colloidal inorganic nanoparticles // Phil. Trans. R. Soc. A. – 2010. – Vol. 368. – P. 1333–1383.</w:t>
+        <w:t>6. Burda C., Chen X., Narayanan R., El-Sayed M.A. Chemistry and properties of nanocrystals of different shapes // Chem. Rev. – 2005. – Vol. 105. – P. 1025–1102.</w:t>
       </w:r>
     </w:p>
     <w:p>
@@ -2051,7 +4533,7 @@
         <w:rPr>
           <w:sz w:val="22"/>
         </w:rPr>
-        <w:t>7. Фролов Ю.Г. Курс коллоидной химии. Поверхностные явления и дисперсные системы. – М.: Химия, 2004.</w:t>
+        <w:t>7. Sperling R.A., Parak W.J. Surface modification, functionalization and bioconjugation of colloidal inorganic nanoparticles // Phil. Trans. R. Soc. A. – 2010. – Vol. 368. – P. 1333–1383.</w:t>
       </w:r>
     </w:p>
     <w:p>
@@ -2063,7 +4545,19 @@
         <w:rPr>
           <w:sz w:val="22"/>
         </w:rPr>
-        <w:t>8. Ahmedov Q.R., Qurbonov A.R. Kolloid kimyo. – Toshkent: O'zbekiston, 2012.</w:t>
+        <w:t>8. Фролов Ю.Г. Курс коллоидной химии. Поверхностные явления и дисперсные системы. – М.: Химия, 2004.</w:t>
+      </w:r>
+    </w:p>
+    <w:p>
+      <w:pPr>
+        <w:spacing w:after="40"/>
+        <w:jc w:val="both"/>
+      </w:pPr>
+      <w:r>
+        <w:rPr>
+          <w:sz w:val="22"/>
+        </w:rPr>
+        <w:t>9. Ahmedov Q.R., Qurbonov A.R. Kolloid kimyo. – Toshkent: O'zbekiston, 2012.</w:t>
       </w:r>
     </w:p>
     <w:sectPr>

</xml_diff>

<commit_message>
docs: biokolloid sistemalar mustaqil ishi; OMML/uslub qurilmasi umumiy modulga ajratildi
Co-authored-by: arena-agent <297053741+arena-agent@users.noreply.github.com>
</commit_message>
<xml_diff>
--- a/docs/oquv/mustaqil-talim/Nanokolloid-sistemalar-mustaqil-ish.docx
+++ b/docs/oquv/mustaqil-talim/Nanokolloid-sistemalar-mustaqil-ish.docx
@@ -132,6 +132,7 @@
     <w:p>
       <w:pPr>
         <w:spacing w:after="40"/>
+        <w:jc w:val="both"/>
       </w:pPr>
       <w:r>
         <w:rPr>
@@ -562,6 +563,7 @@
     <w:p>
       <w:pPr>
         <w:spacing w:after="40"/>
+        <w:jc w:val="both"/>
       </w:pPr>
       <w:r>
         <w:rPr>
@@ -1108,6 +1110,7 @@
     <w:p>
       <w:pPr>
         <w:spacing w:after="40"/>
+        <w:jc w:val="both"/>
       </w:pPr>
       <w:r>
         <w:rPr>
@@ -1428,6 +1431,7 @@
     <w:p>
       <w:pPr>
         <w:spacing w:after="40"/>
+        <w:jc w:val="both"/>
       </w:pPr>
       <w:r>
         <w:rPr>
@@ -3369,6 +3373,7 @@
     <w:p>
       <w:pPr>
         <w:spacing w:after="40"/>
+        <w:jc w:val="both"/>
       </w:pPr>
       <w:r>
         <w:rPr>

</xml_diff>